<commit_message>
doc: Atualiza RNF 10 reponsável pela descrição da LGBD
</commit_message>
<xml_diff>
--- a/docs/ApêndiceB-Requisitos/PID_RequisitosNãoFuncionais.docx
+++ b/docs/ApêndiceB-Requisitos/PID_RequisitosNãoFuncionais.docx
@@ -1,6 +1,6 @@
 
 <file path=word/document.xml><?xml version="1.0" encoding="utf-8"?>
-<w:document xmlns:wpc="http://schemas.microsoft.com/office/word/2010/wordprocessingCanvas" xmlns:mc="http://schemas.openxmlformats.org/markup-compatibility/2006" xmlns:o="urn:schemas-microsoft-com:office:office" xmlns:r="http://schemas.openxmlformats.org/officeDocument/2006/relationships" xmlns:m="http://schemas.openxmlformats.org/officeDocument/2006/math" xmlns:v="urn:schemas-microsoft-com:vml" xmlns:wp14="http://schemas.microsoft.com/office/word/2010/wordprocessingDrawing" xmlns:wp="http://schemas.openxmlformats.org/drawingml/2006/wordprocessingDrawing" xmlns:w10="urn:schemas-microsoft-com:office:word" xmlns:w="http://schemas.openxmlformats.org/wordprocessingml/2006/main" xmlns:w14="http://schemas.microsoft.com/office/word/2010/wordml" xmlns:w15="http://schemas.microsoft.com/office/word/2012/wordml" xmlns:wpg="http://schemas.microsoft.com/office/word/2010/wordprocessingGroup" xmlns:wpi="http://schemas.microsoft.com/office/word/2010/wordprocessingInk" xmlns:wne="http://schemas.microsoft.com/office/word/2006/wordml" xmlns:wps="http://schemas.microsoft.com/office/word/2010/wordprocessingShape" mc:Ignorable="w14 w15 wp14">
+<w:document xmlns:wpc="http://schemas.microsoft.com/office/word/2010/wordprocessingCanvas" xmlns:cx="http://schemas.microsoft.com/office/drawing/2014/chartex" xmlns:cx1="http://schemas.microsoft.com/office/drawing/2015/9/8/chartex" xmlns:cx2="http://schemas.microsoft.com/office/drawing/2015/10/21/chartex" xmlns:cx3="http://schemas.microsoft.com/office/drawing/2016/5/9/chartex" xmlns:cx4="http://schemas.microsoft.com/office/drawing/2016/5/10/chartex" xmlns:cx5="http://schemas.microsoft.com/office/drawing/2016/5/11/chartex" xmlns:cx6="http://schemas.microsoft.com/office/drawing/2016/5/12/chartex" xmlns:cx7="http://schemas.microsoft.com/office/drawing/2016/5/13/chartex" xmlns:cx8="http://schemas.microsoft.com/office/drawing/2016/5/14/chartex" xmlns:mc="http://schemas.openxmlformats.org/markup-compatibility/2006" xmlns:aink="http://schemas.microsoft.com/office/drawing/2016/ink" xmlns:am3d="http://schemas.microsoft.com/office/drawing/2017/model3d" xmlns:o="urn:schemas-microsoft-com:office:office" xmlns:oel="http://schemas.microsoft.com/office/2019/extlst" xmlns:r="http://schemas.openxmlformats.org/officeDocument/2006/relationships" xmlns:m="http://schemas.openxmlformats.org/officeDocument/2006/math" xmlns:v="urn:schemas-microsoft-com:vml" xmlns:wp14="http://schemas.microsoft.com/office/word/2010/wordprocessingDrawing" xmlns:wp="http://schemas.openxmlformats.org/drawingml/2006/wordprocessingDrawing" xmlns:w10="urn:schemas-microsoft-com:office:word" xmlns:w="http://schemas.openxmlformats.org/wordprocessingml/2006/main" xmlns:w14="http://schemas.microsoft.com/office/word/2010/wordml" xmlns:w15="http://schemas.microsoft.com/office/word/2012/wordml" xmlns:w16cex="http://schemas.microsoft.com/office/word/2018/wordml/cex" xmlns:w16cid="http://schemas.microsoft.com/office/word/2016/wordml/cid" xmlns:w16="http://schemas.microsoft.com/office/word/2018/wordml" xmlns:w16sdtdh="http://schemas.microsoft.com/office/word/2020/wordml/sdtdatahash" xmlns:w16se="http://schemas.microsoft.com/office/word/2015/wordml/symex" xmlns:wpg="http://schemas.microsoft.com/office/word/2010/wordprocessingGroup" xmlns:wpi="http://schemas.microsoft.com/office/word/2010/wordprocessingInk" xmlns:wne="http://schemas.microsoft.com/office/word/2006/wordml" xmlns:wps="http://schemas.microsoft.com/office/word/2010/wordprocessingShape" mc:Ignorable="w14 w15 w16se w16cid w16 w16cex w16sdtdh wp14">
   <w:body>
     <w:p>
       <w:pPr>
@@ -274,6 +274,22 @@
               </w:rPr>
               <w:t>Saimon Rafael Ribeiro</w:t>
             </w:r>
+            <w:r>
+              <w:rPr>
+                <w:rFonts w:ascii="Times New Roman" w:eastAsia="Times New Roman" w:hAnsi="Times New Roman" w:cs="Times New Roman"/>
+                <w:sz w:val="24"/>
+                <w:szCs w:val="24"/>
+              </w:rPr>
+              <w:t>, Ryan Henr</w:t>
+            </w:r>
+            <w:r>
+              <w:rPr>
+                <w:rFonts w:ascii="Times New Roman" w:eastAsia="Times New Roman" w:hAnsi="Times New Roman" w:cs="Times New Roman"/>
+                <w:sz w:val="24"/>
+                <w:szCs w:val="24"/>
+              </w:rPr>
+              <w:t>ique Aguiar</w:t>
+            </w:r>
           </w:p>
         </w:tc>
       </w:tr>
@@ -356,15 +372,7 @@
       </w:r>
       <w:r>
         <w:br/>
-        <w:t xml:space="preserve">• O </w:t>
-      </w:r>
-      <w:proofErr w:type="spellStart"/>
-      <w:r>
-        <w:t>token</w:t>
-      </w:r>
-      <w:proofErr w:type="spellEnd"/>
-      <w:r>
-        <w:t xml:space="preserve"> deverá possuir tempo de expiração</w:t>
+        <w:t>• O token deverá possuir tempo de expiração</w:t>
       </w:r>
       <w:r>
         <w:br/>
@@ -420,15 +428,7 @@
         <w:t>Prioridade:</w:t>
       </w:r>
       <w:r>
-        <w:t xml:space="preserve"> (X) essencial </w:t>
-      </w:r>
-      <w:proofErr w:type="gramStart"/>
-      <w:r>
-        <w:t>( )</w:t>
-      </w:r>
-      <w:proofErr w:type="gramEnd"/>
-      <w:r>
-        <w:t xml:space="preserve"> importante ( ) desejável</w:t>
+        <w:t xml:space="preserve"> (X) essencial ( ) importante ( ) desejável</w:t>
       </w:r>
     </w:p>
     <w:p>
@@ -526,15 +526,7 @@
         <w:t>Prioridade:</w:t>
       </w:r>
       <w:r>
-        <w:t xml:space="preserve"> (X) essencial </w:t>
-      </w:r>
-      <w:proofErr w:type="gramStart"/>
-      <w:r>
-        <w:t>( )</w:t>
-      </w:r>
-      <w:proofErr w:type="gramEnd"/>
-      <w:r>
-        <w:t xml:space="preserve"> importante ( ) desejável</w:t>
+        <w:t xml:space="preserve"> (X) essencial ( ) importante ( ) desejável</w:t>
       </w:r>
     </w:p>
     <w:p>
@@ -650,15 +642,7 @@
         <w:t>Prioridade:</w:t>
       </w:r>
       <w:r>
-        <w:t xml:space="preserve"> (X) essencial </w:t>
-      </w:r>
-      <w:proofErr w:type="gramStart"/>
-      <w:r>
-        <w:t>( )</w:t>
-      </w:r>
-      <w:proofErr w:type="gramEnd"/>
-      <w:r>
-        <w:t xml:space="preserve"> importante ( ) desejável</w:t>
+        <w:t xml:space="preserve"> (X) essencial ( ) importante ( ) desejável</w:t>
       </w:r>
     </w:p>
     <w:p>
@@ -701,15 +685,7 @@
         <w:t>Descrição:</w:t>
       </w:r>
       <w:r>
-        <w:t xml:space="preserve"> O sistema deverá funcionar corretamente nos navegadores Google </w:t>
-      </w:r>
-      <w:proofErr w:type="spellStart"/>
-      <w:r>
-        <w:t>Chrome</w:t>
-      </w:r>
-      <w:proofErr w:type="spellEnd"/>
-      <w:r>
-        <w:t>, Mozilla Firefox e Microsoft Edge.</w:t>
+        <w:t xml:space="preserve"> O sistema deverá funcionar corretamente nos navegadores Google Chrome, Mozilla Firefox e Microsoft Edge.</w:t>
       </w:r>
     </w:p>
     <w:p>
@@ -768,15 +744,7 @@
         <w:t>Prioridade:</w:t>
       </w:r>
       <w:r>
-        <w:t xml:space="preserve"> </w:t>
-      </w:r>
-      <w:proofErr w:type="gramStart"/>
-      <w:r>
-        <w:t>( )</w:t>
-      </w:r>
-      <w:proofErr w:type="gramEnd"/>
-      <w:r>
-        <w:t xml:space="preserve"> essencial (X) importante ( ) desejável</w:t>
+        <w:t xml:space="preserve"> ( ) essencial (X) importante ( ) desejável</w:t>
       </w:r>
     </w:p>
     <w:p>
@@ -788,8 +756,6 @@
           <w:szCs w:val="24"/>
         </w:rPr>
       </w:pPr>
-      <w:bookmarkStart w:id="5" w:name="_GoBack"/>
-      <w:bookmarkEnd w:id="5"/>
     </w:p>
     <w:p>
       <w:pPr>
@@ -800,8 +766,8 @@
           <w:szCs w:val="24"/>
         </w:rPr>
       </w:pPr>
-      <w:bookmarkStart w:id="6" w:name="_shyp89rcr1q4" w:colFirst="0" w:colLast="0"/>
-      <w:bookmarkEnd w:id="6"/>
+      <w:bookmarkStart w:id="5" w:name="_shyp89rcr1q4" w:colFirst="0" w:colLast="0"/>
+      <w:bookmarkEnd w:id="5"/>
       <w:r>
         <w:rPr>
           <w:rFonts w:ascii="Times New Roman" w:hAnsi="Times New Roman" w:cs="Times New Roman"/>
@@ -886,15 +852,7 @@
         <w:t>Prioridade:</w:t>
       </w:r>
       <w:r>
-        <w:t xml:space="preserve"> (X) essencial </w:t>
-      </w:r>
-      <w:proofErr w:type="gramStart"/>
-      <w:r>
-        <w:t>( )</w:t>
-      </w:r>
-      <w:proofErr w:type="gramEnd"/>
-      <w:r>
-        <w:t xml:space="preserve"> importante ( ) desejável</w:t>
+        <w:t xml:space="preserve"> (X) essencial ( ) importante ( ) desejável</w:t>
       </w:r>
     </w:p>
     <w:p>
@@ -916,8 +874,8 @@
           <w:szCs w:val="24"/>
         </w:rPr>
       </w:pPr>
-      <w:bookmarkStart w:id="7" w:name="_y8clv8x3rhq1" w:colFirst="0" w:colLast="0"/>
-      <w:bookmarkEnd w:id="7"/>
+      <w:bookmarkStart w:id="6" w:name="_y8clv8x3rhq1" w:colFirst="0" w:colLast="0"/>
+      <w:bookmarkEnd w:id="6"/>
       <w:r>
         <w:rPr>
           <w:rFonts w:ascii="Times New Roman" w:hAnsi="Times New Roman" w:cs="Times New Roman"/>
@@ -1001,15 +959,7 @@
         <w:t>Prioridade:</w:t>
       </w:r>
       <w:r>
-        <w:t xml:space="preserve"> (X) essencial </w:t>
-      </w:r>
-      <w:proofErr w:type="gramStart"/>
-      <w:r>
-        <w:t>( )</w:t>
-      </w:r>
-      <w:proofErr w:type="gramEnd"/>
-      <w:r>
-        <w:t xml:space="preserve"> importante ( ) desejável</w:t>
+        <w:t xml:space="preserve"> (X) essencial ( ) importante ( ) desejável</w:t>
       </w:r>
     </w:p>
     <w:p>
@@ -1031,8 +981,8 @@
           <w:szCs w:val="24"/>
         </w:rPr>
       </w:pPr>
-      <w:bookmarkStart w:id="8" w:name="_wj9r27qo4b9d" w:colFirst="0" w:colLast="0"/>
-      <w:bookmarkEnd w:id="8"/>
+      <w:bookmarkStart w:id="7" w:name="_wj9r27qo4b9d" w:colFirst="0" w:colLast="0"/>
+      <w:bookmarkEnd w:id="7"/>
       <w:r>
         <w:rPr>
           <w:rFonts w:ascii="Times New Roman" w:hAnsi="Times New Roman" w:cs="Times New Roman"/>
@@ -1112,15 +1062,7 @@
         <w:t>Prioridade:</w:t>
       </w:r>
       <w:r>
-        <w:t xml:space="preserve"> (X) essencial </w:t>
-      </w:r>
-      <w:proofErr w:type="gramStart"/>
-      <w:r>
-        <w:t>( )</w:t>
-      </w:r>
-      <w:proofErr w:type="gramEnd"/>
-      <w:r>
-        <w:t xml:space="preserve"> importante ( ) desejável</w:t>
+        <w:t xml:space="preserve"> (X) essencial ( ) importante ( ) desejável</w:t>
       </w:r>
     </w:p>
     <w:p>
@@ -1137,8 +1079,8 @@
           <w:szCs w:val="24"/>
         </w:rPr>
       </w:pPr>
-      <w:bookmarkStart w:id="9" w:name="_3cdy66x8cht0" w:colFirst="0" w:colLast="0"/>
-      <w:bookmarkEnd w:id="9"/>
+      <w:bookmarkStart w:id="8" w:name="_3cdy66x8cht0" w:colFirst="0" w:colLast="0"/>
+      <w:bookmarkEnd w:id="8"/>
       <w:r>
         <w:rPr>
           <w:rFonts w:ascii="Times New Roman" w:hAnsi="Times New Roman" w:cs="Times New Roman"/>
@@ -1219,15 +1161,7 @@
         <w:t>Prioridade:</w:t>
       </w:r>
       <w:r>
-        <w:t xml:space="preserve"> </w:t>
-      </w:r>
-      <w:proofErr w:type="gramStart"/>
-      <w:r>
-        <w:t>( )</w:t>
-      </w:r>
-      <w:proofErr w:type="gramEnd"/>
-      <w:r>
-        <w:t xml:space="preserve"> essencial (X) importante ( ) desejável</w:t>
+        <w:t xml:space="preserve"> ( ) essencial (X) importante ( ) desejável</w:t>
       </w:r>
     </w:p>
     <w:p>
@@ -1249,8 +1183,8 @@
           <w:szCs w:val="24"/>
         </w:rPr>
       </w:pPr>
-      <w:bookmarkStart w:id="10" w:name="_cbutrq15srg6" w:colFirst="0" w:colLast="0"/>
-      <w:bookmarkEnd w:id="10"/>
+      <w:bookmarkStart w:id="9" w:name="_cbutrq15srg6" w:colFirst="0" w:colLast="0"/>
+      <w:bookmarkEnd w:id="9"/>
       <w:r>
         <w:rPr>
           <w:rFonts w:ascii="Times New Roman" w:hAnsi="Times New Roman" w:cs="Times New Roman"/>
@@ -1330,15 +1264,7 @@
         <w:t>Prioridade:</w:t>
       </w:r>
       <w:r>
-        <w:t xml:space="preserve"> (X) essencial </w:t>
-      </w:r>
-      <w:proofErr w:type="gramStart"/>
-      <w:r>
-        <w:t>( )</w:t>
-      </w:r>
-      <w:proofErr w:type="gramEnd"/>
-      <w:r>
-        <w:t xml:space="preserve"> importante ( ) desejável</w:t>
+        <w:t xml:space="preserve"> (X) essencial ( ) importante ( ) desejável</w:t>
       </w:r>
     </w:p>
     <w:p>
@@ -1360,8 +1286,8 @@
           <w:szCs w:val="24"/>
         </w:rPr>
       </w:pPr>
-      <w:bookmarkStart w:id="11" w:name="_sxdzmciz8oa6" w:colFirst="0" w:colLast="0"/>
-      <w:bookmarkEnd w:id="11"/>
+      <w:bookmarkStart w:id="10" w:name="_sxdzmciz8oa6" w:colFirst="0" w:colLast="0"/>
+      <w:bookmarkEnd w:id="10"/>
       <w:r>
         <w:rPr>
           <w:rFonts w:ascii="Times New Roman" w:hAnsi="Times New Roman" w:cs="Times New Roman"/>
@@ -1373,83 +1299,445 @@
     </w:p>
     <w:p>
       <w:pPr>
-        <w:pStyle w:val="NormalWeb"/>
-      </w:pPr>
-      <w:r>
-        <w:rPr>
-          <w:rStyle w:val="Forte"/>
-        </w:rPr>
-        <w:t>Descrição:</w:t>
-      </w:r>
-      <w:r>
-        <w:t xml:space="preserve"> O sistema deverá seguir as diretrizes da Lei Geral de Proteção de Dados (LGPD), garantindo privacidade e proteção das informações dos usuários.</w:t>
-      </w:r>
+        <w:rPr>
+          <w:rFonts w:ascii="Times New Roman" w:eastAsia="Times New Roman" w:hAnsi="Times New Roman" w:cs="Times New Roman"/>
+          <w:b/>
+          <w:bCs/>
+          <w:sz w:val="24"/>
+          <w:szCs w:val="24"/>
+        </w:rPr>
+      </w:pPr>
     </w:p>
     <w:p>
       <w:pPr>
-        <w:pStyle w:val="NormalWeb"/>
-      </w:pPr>
-      <w:r>
-        <w:rPr>
-          <w:rStyle w:val="Forte"/>
-        </w:rPr>
-        <w:t>Restrições:</w:t>
-      </w:r>
-      <w:r>
-        <w:br/>
-        <w:t>• Dados pessoais não poderão ser compartilhados sem autorização</w:t>
+        <w:rPr>
+          <w:rFonts w:ascii="Times New Roman" w:eastAsia="Times New Roman" w:hAnsi="Times New Roman" w:cs="Times New Roman"/>
+          <w:sz w:val="24"/>
+          <w:szCs w:val="24"/>
+        </w:rPr>
+      </w:pPr>
+      <w:r>
+        <w:rPr>
+          <w:rFonts w:ascii="Times New Roman" w:eastAsia="Times New Roman" w:hAnsi="Times New Roman" w:cs="Times New Roman"/>
+          <w:b/>
+          <w:bCs/>
+          <w:sz w:val="24"/>
+          <w:szCs w:val="24"/>
+        </w:rPr>
+        <w:t>Descrição:</w:t>
+      </w:r>
+      <w:r>
+        <w:rPr>
+          <w:rFonts w:ascii="Times New Roman" w:eastAsia="Times New Roman" w:hAnsi="Times New Roman" w:cs="Times New Roman"/>
+          <w:sz w:val="24"/>
+          <w:szCs w:val="24"/>
+        </w:rPr>
+        <w:t xml:space="preserve"> O sistema deverá garantir a privacidade dos usuários e o cumprimento dos direitos dos titulares de dados pessoais em conformidade com a Lei Geral de Proteção de Dados (Lei nº 13.709/2018).</w:t>
       </w:r>
     </w:p>
     <w:p>
       <w:pPr>
-        <w:pStyle w:val="NormalWeb"/>
-      </w:pPr>
-      <w:r>
-        <w:rPr>
-          <w:rStyle w:val="Forte"/>
-        </w:rPr>
-        <w:t>Exceções:</w:t>
-      </w:r>
-      <w:r>
-        <w:br/>
-        <w:t>• Solicitação judicial ou legal</w:t>
+        <w:rPr>
+          <w:rFonts w:ascii="Times New Roman" w:eastAsia="Times New Roman" w:hAnsi="Times New Roman" w:cs="Times New Roman"/>
+          <w:b/>
+          <w:bCs/>
+          <w:sz w:val="24"/>
+          <w:szCs w:val="24"/>
+        </w:rPr>
+      </w:pPr>
+      <w:r>
+        <w:rPr>
+          <w:rFonts w:ascii="Times New Roman" w:eastAsia="Times New Roman" w:hAnsi="Times New Roman" w:cs="Times New Roman"/>
+          <w:b/>
+          <w:bCs/>
+          <w:sz w:val="24"/>
+          <w:szCs w:val="24"/>
+        </w:rPr>
+        <w:t>Restrições:</w:t>
       </w:r>
     </w:p>
     <w:p>
       <w:pPr>
-        <w:pStyle w:val="NormalWeb"/>
-      </w:pPr>
-      <w:r>
-        <w:rPr>
-          <w:rStyle w:val="Forte"/>
-        </w:rPr>
-        <w:t>Saída:</w:t>
-      </w:r>
-      <w:r>
-        <w:br/>
-        <w:t>• Proteção adequada dos dados dos usuários</w:t>
+        <w:pStyle w:val="PargrafodaLista"/>
+        <w:numPr>
+          <w:ilvl w:val="0"/>
+          <w:numId w:val="42"/>
+        </w:numPr>
+        <w:rPr>
+          <w:rFonts w:ascii="Times New Roman" w:eastAsia="Times New Roman" w:hAnsi="Times New Roman" w:cs="Times New Roman"/>
+          <w:sz w:val="24"/>
+          <w:szCs w:val="24"/>
+        </w:rPr>
+      </w:pPr>
+      <w:r>
+        <w:rPr>
+          <w:rFonts w:ascii="Times New Roman" w:eastAsia="Times New Roman" w:hAnsi="Times New Roman" w:cs="Times New Roman"/>
+          <w:sz w:val="24"/>
+          <w:szCs w:val="24"/>
+        </w:rPr>
+        <w:t>Gestão de Consentimento (Art. 7º, I e Art. 8º): O sistema deve registrar a confirmação explícita de aceite dos Termos de Uso e Política de Privacidade (salvando data, hora e IP do usuário no banco).</w:t>
       </w:r>
     </w:p>
     <w:p>
       <w:pPr>
-        <w:pStyle w:val="NormalWeb"/>
-      </w:pPr>
-      <w:r>
-        <w:rPr>
-          <w:rStyle w:val="Forte"/>
-        </w:rPr>
-        <w:t>Prioridade:</w:t>
-      </w:r>
-      <w:r>
-        <w:t xml:space="preserve"> (X) essencial </w:t>
-      </w:r>
-      <w:proofErr w:type="gramStart"/>
-      <w:r>
-        <w:t>( )</w:t>
-      </w:r>
-      <w:proofErr w:type="gramEnd"/>
-      <w:r>
-        <w:t xml:space="preserve"> importante ( ) desejável</w:t>
+        <w:pStyle w:val="PargrafodaLista"/>
+        <w:numPr>
+          <w:ilvl w:val="0"/>
+          <w:numId w:val="42"/>
+        </w:numPr>
+        <w:rPr>
+          <w:rFonts w:ascii="Times New Roman" w:eastAsia="Times New Roman" w:hAnsi="Times New Roman" w:cs="Times New Roman"/>
+          <w:sz w:val="24"/>
+          <w:szCs w:val="24"/>
+        </w:rPr>
+      </w:pPr>
+      <w:r>
+        <w:rPr>
+          <w:rFonts w:ascii="Times New Roman" w:eastAsia="Times New Roman" w:hAnsi="Times New Roman" w:cs="Times New Roman"/>
+          <w:sz w:val="24"/>
+          <w:szCs w:val="24"/>
+        </w:rPr>
+        <w:t>Direito de Eliminação e Anonimização (Art. 18, IV e VI): O sistema deve disponibilizar funcionalidade de exclusão de conta, aplicando a anonimização ou apaganço definitivo de dados pessoais (nome, telefone, fotos, CPF, endereço).</w:t>
+      </w:r>
+    </w:p>
+    <w:p>
+      <w:pPr>
+        <w:pStyle w:val="PargrafodaLista"/>
+        <w:numPr>
+          <w:ilvl w:val="0"/>
+          <w:numId w:val="42"/>
+        </w:numPr>
+        <w:rPr>
+          <w:rFonts w:ascii="Times New Roman" w:eastAsia="Times New Roman" w:hAnsi="Times New Roman" w:cs="Times New Roman"/>
+          <w:sz w:val="24"/>
+          <w:szCs w:val="24"/>
+        </w:rPr>
+      </w:pPr>
+      <w:r>
+        <w:rPr>
+          <w:rFonts w:ascii="Times New Roman" w:eastAsia="Times New Roman" w:hAnsi="Times New Roman" w:cs="Times New Roman"/>
+          <w:sz w:val="24"/>
+          <w:szCs w:val="24"/>
+        </w:rPr>
+        <w:lastRenderedPageBreak/>
+        <w:t>Direito de Acesso e Portabilidade (Art. 18, II e V): O sistema deve permitir que o usuário baixe/exporte seus dados cadastrais em formato estruturado (JSON ou PDF).</w:t>
+      </w:r>
+    </w:p>
+    <w:p>
+      <w:pPr>
+        <w:pStyle w:val="PargrafodaLista"/>
+        <w:numPr>
+          <w:ilvl w:val="0"/>
+          <w:numId w:val="42"/>
+        </w:numPr>
+        <w:rPr>
+          <w:rFonts w:ascii="Times New Roman" w:eastAsia="Times New Roman" w:hAnsi="Times New Roman" w:cs="Times New Roman"/>
+          <w:sz w:val="24"/>
+          <w:szCs w:val="24"/>
+        </w:rPr>
+      </w:pPr>
+      <w:r>
+        <w:rPr>
+          <w:rFonts w:ascii="Times New Roman" w:eastAsia="Times New Roman" w:hAnsi="Times New Roman" w:cs="Times New Roman"/>
+          <w:sz w:val="24"/>
+          <w:szCs w:val="24"/>
+        </w:rPr>
+        <w:t>Segurança e Minimização (Art. 6º, III e Art. 46): O sistema deve aplicar mascaramento em telas públicas para dados sensíveis/pessoais (ex: CPF e e-mail parciais) e não solicitar dados desnecessários para o funcionamento da aplicação.</w:t>
+      </w:r>
+    </w:p>
+    <w:p>
+      <w:pPr>
+        <w:pStyle w:val="PargrafodaLista"/>
+        <w:numPr>
+          <w:ilvl w:val="0"/>
+          <w:numId w:val="42"/>
+        </w:numPr>
+        <w:rPr>
+          <w:rFonts w:ascii="Times New Roman" w:eastAsia="Times New Roman" w:hAnsi="Times New Roman" w:cs="Times New Roman"/>
+          <w:sz w:val="24"/>
+          <w:szCs w:val="24"/>
+        </w:rPr>
+      </w:pPr>
+      <w:r>
+        <w:rPr>
+          <w:rFonts w:ascii="Times New Roman" w:eastAsia="Times New Roman" w:hAnsi="Times New Roman" w:cs="Times New Roman"/>
+          <w:sz w:val="24"/>
+          <w:szCs w:val="24"/>
+        </w:rPr>
+        <w:t>Revogação do Consentimento (Art. 8º, § 5º): O usuário deve ter acesso a um painel em seu perfil onde possa revogar a autorização de uso de seus dados a qualquer momento.</w:t>
+      </w:r>
+    </w:p>
+    <w:p>
+      <w:pPr>
+        <w:rPr>
+          <w:rFonts w:ascii="Times New Roman" w:eastAsia="Times New Roman" w:hAnsi="Times New Roman" w:cs="Times New Roman"/>
+          <w:b/>
+          <w:bCs/>
+          <w:sz w:val="24"/>
+          <w:szCs w:val="24"/>
+        </w:rPr>
+      </w:pPr>
+      <w:r>
+        <w:rPr>
+          <w:rFonts w:ascii="Times New Roman" w:eastAsia="Times New Roman" w:hAnsi="Times New Roman" w:cs="Times New Roman"/>
+          <w:b/>
+          <w:bCs/>
+          <w:sz w:val="24"/>
+          <w:szCs w:val="24"/>
+        </w:rPr>
+        <w:t>Exceções:</w:t>
+      </w:r>
+    </w:p>
+    <w:p>
+      <w:pPr>
+        <w:numPr>
+          <w:ilvl w:val="1"/>
+          <w:numId w:val="40"/>
+        </w:numPr>
+        <w:rPr>
+          <w:rFonts w:ascii="Times New Roman" w:eastAsia="Times New Roman" w:hAnsi="Times New Roman" w:cs="Times New Roman"/>
+          <w:sz w:val="24"/>
+          <w:szCs w:val="24"/>
+        </w:rPr>
+      </w:pPr>
+      <w:r>
+        <w:rPr>
+          <w:rFonts w:ascii="Times New Roman" w:eastAsia="Times New Roman" w:hAnsi="Times New Roman" w:cs="Times New Roman"/>
+          <w:sz w:val="24"/>
+          <w:szCs w:val="24"/>
+        </w:rPr>
+        <w:t>Retenção Obrigatória (Art. 16, I): Dados cadastrais e logs de acesso não poderão ser excluídos imediatamente caso haja obrigação legal de guarda (como a exigência do Marco Civil da Internet – Lei nº 12.965/2014, Art. 15, de reter logs por 6 meses).</w:t>
+      </w:r>
+    </w:p>
+    <w:p>
+      <w:pPr>
+        <w:numPr>
+          <w:ilvl w:val="1"/>
+          <w:numId w:val="40"/>
+        </w:numPr>
+        <w:rPr>
+          <w:rFonts w:ascii="Times New Roman" w:eastAsia="Times New Roman" w:hAnsi="Times New Roman" w:cs="Times New Roman"/>
+          <w:sz w:val="24"/>
+          <w:szCs w:val="24"/>
+        </w:rPr>
+      </w:pPr>
+      <w:r>
+        <w:rPr>
+          <w:rFonts w:ascii="Times New Roman" w:eastAsia="Times New Roman" w:hAnsi="Times New Roman" w:cs="Times New Roman"/>
+          <w:sz w:val="24"/>
+          <w:szCs w:val="24"/>
+        </w:rPr>
+        <w:t>Solicitação Judicial (Art. 7º, VI): Disponibilização de dados mediante ordem do poder judiciário.</w:t>
+      </w:r>
+    </w:p>
+    <w:p>
+      <w:pPr>
+        <w:rPr>
+          <w:rFonts w:ascii="Times New Roman" w:eastAsia="Times New Roman" w:hAnsi="Times New Roman" w:cs="Times New Roman"/>
+          <w:b/>
+          <w:bCs/>
+          <w:sz w:val="24"/>
+          <w:szCs w:val="24"/>
+        </w:rPr>
+      </w:pPr>
+      <w:r>
+        <w:rPr>
+          <w:rFonts w:ascii="Times New Roman" w:eastAsia="Times New Roman" w:hAnsi="Times New Roman" w:cs="Times New Roman"/>
+          <w:b/>
+          <w:bCs/>
+          <w:sz w:val="24"/>
+          <w:szCs w:val="24"/>
+        </w:rPr>
+        <w:t>Saída:</w:t>
+      </w:r>
+    </w:p>
+    <w:p>
+      <w:pPr>
+        <w:numPr>
+          <w:ilvl w:val="1"/>
+          <w:numId w:val="40"/>
+        </w:numPr>
+        <w:rPr>
+          <w:rFonts w:ascii="Times New Roman" w:eastAsia="Times New Roman" w:hAnsi="Times New Roman" w:cs="Times New Roman"/>
+          <w:sz w:val="24"/>
+          <w:szCs w:val="24"/>
+        </w:rPr>
+      </w:pPr>
+      <w:r>
+        <w:rPr>
+          <w:rFonts w:ascii="Times New Roman" w:eastAsia="Times New Roman" w:hAnsi="Times New Roman" w:cs="Times New Roman"/>
+          <w:sz w:val="24"/>
+          <w:szCs w:val="24"/>
+        </w:rPr>
+        <w:t>Trilhas de auditoria dos consentimentos armazenadas.</w:t>
+      </w:r>
+    </w:p>
+    <w:p>
+      <w:pPr>
+        <w:numPr>
+          <w:ilvl w:val="1"/>
+          <w:numId w:val="40"/>
+        </w:numPr>
+        <w:rPr>
+          <w:rFonts w:ascii="Times New Roman" w:eastAsia="Times New Roman" w:hAnsi="Times New Roman" w:cs="Times New Roman"/>
+          <w:sz w:val="24"/>
+          <w:szCs w:val="24"/>
+        </w:rPr>
+      </w:pPr>
+      <w:r>
+        <w:rPr>
+          <w:rFonts w:ascii="Times New Roman" w:eastAsia="Times New Roman" w:hAnsi="Times New Roman" w:cs="Times New Roman"/>
+          <w:sz w:val="24"/>
+          <w:szCs w:val="24"/>
+        </w:rPr>
+        <w:t>Solicitação de exportação de dados processada com sucesso.</w:t>
+      </w:r>
+    </w:p>
+    <w:p>
+      <w:pPr>
+        <w:numPr>
+          <w:ilvl w:val="1"/>
+          <w:numId w:val="40"/>
+        </w:numPr>
+        <w:rPr>
+          <w:rFonts w:ascii="Times New Roman" w:eastAsia="Times New Roman" w:hAnsi="Times New Roman" w:cs="Times New Roman"/>
+          <w:sz w:val="24"/>
+          <w:szCs w:val="24"/>
+        </w:rPr>
+      </w:pPr>
+      <w:r>
+        <w:rPr>
+          <w:rFonts w:ascii="Times New Roman" w:eastAsia="Times New Roman" w:hAnsi="Times New Roman" w:cs="Times New Roman"/>
+          <w:sz w:val="24"/>
+          <w:szCs w:val="24"/>
+        </w:rPr>
+        <w:t>Conta anonimizada/excluída com sucesso mediante solicitação.</w:t>
+      </w:r>
+    </w:p>
+    <w:p>
+      <w:pPr>
+        <w:numPr>
+          <w:ilvl w:val="0"/>
+          <w:numId w:val="40"/>
+        </w:numPr>
+        <w:rPr>
+          <w:rFonts w:ascii="Times New Roman" w:eastAsia="Times New Roman" w:hAnsi="Times New Roman" w:cs="Times New Roman"/>
+          <w:sz w:val="24"/>
+          <w:szCs w:val="24"/>
+        </w:rPr>
+      </w:pPr>
+      <w:r>
+        <w:rPr>
+          <w:rFonts w:ascii="Times New Roman" w:eastAsia="Times New Roman" w:hAnsi="Times New Roman" w:cs="Times New Roman"/>
+          <w:sz w:val="24"/>
+          <w:szCs w:val="24"/>
+        </w:rPr>
+        <w:t>Prioridade: (X) essencial ( ) importante ( ) desejável</w:t>
+      </w:r>
+    </w:p>
+    <w:p>
+      <w:pPr>
+        <w:rPr>
+          <w:rFonts w:ascii="Times New Roman" w:eastAsia="Times New Roman" w:hAnsi="Times New Roman" w:cs="Times New Roman"/>
+          <w:b/>
+          <w:bCs/>
+          <w:sz w:val="24"/>
+          <w:szCs w:val="24"/>
+        </w:rPr>
+      </w:pPr>
+      <w:r>
+        <w:rPr>
+          <w:rFonts w:ascii="Times New Roman" w:eastAsia="Times New Roman" w:hAnsi="Times New Roman" w:cs="Times New Roman"/>
+          <w:b/>
+          <w:bCs/>
+          <w:sz w:val="24"/>
+          <w:szCs w:val="24"/>
+        </w:rPr>
+        <w:t>Principais artigos citados para referência na apresentação:</w:t>
+      </w:r>
+    </w:p>
+    <w:p>
+      <w:pPr>
+        <w:numPr>
+          <w:ilvl w:val="0"/>
+          <w:numId w:val="41"/>
+        </w:numPr>
+        <w:rPr>
+          <w:rFonts w:ascii="Times New Roman" w:eastAsia="Times New Roman" w:hAnsi="Times New Roman" w:cs="Times New Roman"/>
+          <w:sz w:val="24"/>
+          <w:szCs w:val="24"/>
+        </w:rPr>
+      </w:pPr>
+      <w:r>
+        <w:rPr>
+          <w:rFonts w:ascii="Times New Roman" w:eastAsia="Times New Roman" w:hAnsi="Times New Roman" w:cs="Times New Roman"/>
+          <w:sz w:val="24"/>
+          <w:szCs w:val="24"/>
+        </w:rPr>
+        <w:t>Art. 6º: Princípios da adequação, necessidade e segurança.</w:t>
+      </w:r>
+    </w:p>
+    <w:p>
+      <w:pPr>
+        <w:numPr>
+          <w:ilvl w:val="0"/>
+          <w:numId w:val="41"/>
+        </w:numPr>
+        <w:rPr>
+          <w:rFonts w:ascii="Times New Roman" w:eastAsia="Times New Roman" w:hAnsi="Times New Roman" w:cs="Times New Roman"/>
+          <w:sz w:val="24"/>
+          <w:szCs w:val="24"/>
+        </w:rPr>
+      </w:pPr>
+      <w:r>
+        <w:rPr>
+          <w:rFonts w:ascii="Times New Roman" w:eastAsia="Times New Roman" w:hAnsi="Times New Roman" w:cs="Times New Roman"/>
+          <w:sz w:val="24"/>
+          <w:szCs w:val="24"/>
+        </w:rPr>
+        <w:t>Art. 8º: Regras sobre como o consentimento deve ser colhido e revogado.</w:t>
+      </w:r>
+    </w:p>
+    <w:p>
+      <w:pPr>
+        <w:numPr>
+          <w:ilvl w:val="0"/>
+          <w:numId w:val="41"/>
+        </w:numPr>
+        <w:rPr>
+          <w:rFonts w:ascii="Times New Roman" w:eastAsia="Times New Roman" w:hAnsi="Times New Roman" w:cs="Times New Roman"/>
+          <w:sz w:val="24"/>
+          <w:szCs w:val="24"/>
+        </w:rPr>
+      </w:pPr>
+      <w:r>
+        <w:rPr>
+          <w:rFonts w:ascii="Times New Roman" w:eastAsia="Times New Roman" w:hAnsi="Times New Roman" w:cs="Times New Roman"/>
+          <w:sz w:val="24"/>
+          <w:szCs w:val="24"/>
+        </w:rPr>
+        <w:t>Art. 18: Lista dos direitos do titular (acesso, portabilidade, exclusão).</w:t>
+      </w:r>
+    </w:p>
+    <w:p>
+      <w:pPr>
+        <w:numPr>
+          <w:ilvl w:val="0"/>
+          <w:numId w:val="41"/>
+        </w:numPr>
+        <w:rPr>
+          <w:rFonts w:ascii="Times New Roman" w:eastAsia="Times New Roman" w:hAnsi="Times New Roman" w:cs="Times New Roman"/>
+          <w:sz w:val="24"/>
+          <w:szCs w:val="24"/>
+        </w:rPr>
+      </w:pPr>
+      <w:r>
+        <w:rPr>
+          <w:rFonts w:ascii="Times New Roman" w:eastAsia="Times New Roman" w:hAnsi="Times New Roman" w:cs="Times New Roman"/>
+          <w:sz w:val="24"/>
+          <w:szCs w:val="24"/>
+        </w:rPr>
+        <w:t>Art. 46: Dever de adotar medidas técnicas de segurança da informação.</w:t>
       </w:r>
     </w:p>
     <w:p>
@@ -1478,7 +1766,7 @@
 </file>
 
 <file path=word/endnotes.xml><?xml version="1.0" encoding="utf-8"?>
-<w:endnotes xmlns:wpc="http://schemas.microsoft.com/office/word/2010/wordprocessingCanvas" xmlns:mc="http://schemas.openxmlformats.org/markup-compatibility/2006" xmlns:o="urn:schemas-microsoft-com:office:office" xmlns:r="http://schemas.openxmlformats.org/officeDocument/2006/relationships" xmlns:m="http://schemas.openxmlformats.org/officeDocument/2006/math" xmlns:v="urn:schemas-microsoft-com:vml" xmlns:wp14="http://schemas.microsoft.com/office/word/2010/wordprocessingDrawing" xmlns:wp="http://schemas.openxmlformats.org/drawingml/2006/wordprocessingDrawing" xmlns:w10="urn:schemas-microsoft-com:office:word" xmlns:w="http://schemas.openxmlformats.org/wordprocessingml/2006/main" xmlns:w14="http://schemas.microsoft.com/office/word/2010/wordml" xmlns:w15="http://schemas.microsoft.com/office/word/2012/wordml" xmlns:wpg="http://schemas.microsoft.com/office/word/2010/wordprocessingGroup" xmlns:wpi="http://schemas.microsoft.com/office/word/2010/wordprocessingInk" xmlns:wne="http://schemas.microsoft.com/office/word/2006/wordml" xmlns:wps="http://schemas.microsoft.com/office/word/2010/wordprocessingShape" mc:Ignorable="w14 w15 wp14">
+<w:endnotes xmlns:wpc="http://schemas.microsoft.com/office/word/2010/wordprocessingCanvas" xmlns:cx="http://schemas.microsoft.com/office/drawing/2014/chartex" xmlns:cx1="http://schemas.microsoft.com/office/drawing/2015/9/8/chartex" xmlns:cx2="http://schemas.microsoft.com/office/drawing/2015/10/21/chartex" xmlns:cx3="http://schemas.microsoft.com/office/drawing/2016/5/9/chartex" xmlns:cx4="http://schemas.microsoft.com/office/drawing/2016/5/10/chartex" xmlns:cx5="http://schemas.microsoft.com/office/drawing/2016/5/11/chartex" xmlns:cx6="http://schemas.microsoft.com/office/drawing/2016/5/12/chartex" xmlns:cx7="http://schemas.microsoft.com/office/drawing/2016/5/13/chartex" xmlns:cx8="http://schemas.microsoft.com/office/drawing/2016/5/14/chartex" xmlns:mc="http://schemas.openxmlformats.org/markup-compatibility/2006" xmlns:aink="http://schemas.microsoft.com/office/drawing/2016/ink" xmlns:am3d="http://schemas.microsoft.com/office/drawing/2017/model3d" xmlns:o="urn:schemas-microsoft-com:office:office" xmlns:oel="http://schemas.microsoft.com/office/2019/extlst" xmlns:r="http://schemas.openxmlformats.org/officeDocument/2006/relationships" xmlns:m="http://schemas.openxmlformats.org/officeDocument/2006/math" xmlns:v="urn:schemas-microsoft-com:vml" xmlns:wp14="http://schemas.microsoft.com/office/word/2010/wordprocessingDrawing" xmlns:wp="http://schemas.openxmlformats.org/drawingml/2006/wordprocessingDrawing" xmlns:w10="urn:schemas-microsoft-com:office:word" xmlns:w="http://schemas.openxmlformats.org/wordprocessingml/2006/main" xmlns:w14="http://schemas.microsoft.com/office/word/2010/wordml" xmlns:w15="http://schemas.microsoft.com/office/word/2012/wordml" xmlns:w16cex="http://schemas.microsoft.com/office/word/2018/wordml/cex" xmlns:w16cid="http://schemas.microsoft.com/office/word/2016/wordml/cid" xmlns:w16="http://schemas.microsoft.com/office/word/2018/wordml" xmlns:w16sdtdh="http://schemas.microsoft.com/office/word/2020/wordml/sdtdatahash" xmlns:w16se="http://schemas.microsoft.com/office/word/2015/wordml/symex" xmlns:wpg="http://schemas.microsoft.com/office/word/2010/wordprocessingGroup" xmlns:wpi="http://schemas.microsoft.com/office/word/2010/wordprocessingInk" xmlns:wne="http://schemas.microsoft.com/office/word/2006/wordml" xmlns:wps="http://schemas.microsoft.com/office/word/2010/wordprocessingShape" mc:Ignorable="w14 w15 w16se w16cid w16 w16cex w16sdtdh wp14">
   <w:endnote w:type="separator" w:id="-1">
     <w:p>
       <w:pPr>
@@ -1503,7 +1791,7 @@
 </file>
 
 <file path=word/footer1.xml><?xml version="1.0" encoding="utf-8"?>
-<w:ftr xmlns:wpc="http://schemas.microsoft.com/office/word/2010/wordprocessingCanvas" xmlns:mc="http://schemas.openxmlformats.org/markup-compatibility/2006" xmlns:o="urn:schemas-microsoft-com:office:office" xmlns:r="http://schemas.openxmlformats.org/officeDocument/2006/relationships" xmlns:m="http://schemas.openxmlformats.org/officeDocument/2006/math" xmlns:v="urn:schemas-microsoft-com:vml" xmlns:wp14="http://schemas.microsoft.com/office/word/2010/wordprocessingDrawing" xmlns:wp="http://schemas.openxmlformats.org/drawingml/2006/wordprocessingDrawing" xmlns:w10="urn:schemas-microsoft-com:office:word" xmlns:w="http://schemas.openxmlformats.org/wordprocessingml/2006/main" xmlns:w14="http://schemas.microsoft.com/office/word/2010/wordml" xmlns:w15="http://schemas.microsoft.com/office/word/2012/wordml" xmlns:wpg="http://schemas.microsoft.com/office/word/2010/wordprocessingGroup" xmlns:wpi="http://schemas.microsoft.com/office/word/2010/wordprocessingInk" xmlns:wne="http://schemas.microsoft.com/office/word/2006/wordml" xmlns:wps="http://schemas.microsoft.com/office/word/2010/wordprocessingShape" mc:Ignorable="w14 w15 wp14">
+<w:ftr xmlns:wpc="http://schemas.microsoft.com/office/word/2010/wordprocessingCanvas" xmlns:cx="http://schemas.microsoft.com/office/drawing/2014/chartex" xmlns:cx1="http://schemas.microsoft.com/office/drawing/2015/9/8/chartex" xmlns:cx2="http://schemas.microsoft.com/office/drawing/2015/10/21/chartex" xmlns:cx3="http://schemas.microsoft.com/office/drawing/2016/5/9/chartex" xmlns:cx4="http://schemas.microsoft.com/office/drawing/2016/5/10/chartex" xmlns:cx5="http://schemas.microsoft.com/office/drawing/2016/5/11/chartex" xmlns:cx6="http://schemas.microsoft.com/office/drawing/2016/5/12/chartex" xmlns:cx7="http://schemas.microsoft.com/office/drawing/2016/5/13/chartex" xmlns:cx8="http://schemas.microsoft.com/office/drawing/2016/5/14/chartex" xmlns:mc="http://schemas.openxmlformats.org/markup-compatibility/2006" xmlns:aink="http://schemas.microsoft.com/office/drawing/2016/ink" xmlns:am3d="http://schemas.microsoft.com/office/drawing/2017/model3d" xmlns:o="urn:schemas-microsoft-com:office:office" xmlns:oel="http://schemas.microsoft.com/office/2019/extlst" xmlns:r="http://schemas.openxmlformats.org/officeDocument/2006/relationships" xmlns:m="http://schemas.openxmlformats.org/officeDocument/2006/math" xmlns:v="urn:schemas-microsoft-com:vml" xmlns:wp14="http://schemas.microsoft.com/office/word/2010/wordprocessingDrawing" xmlns:wp="http://schemas.openxmlformats.org/drawingml/2006/wordprocessingDrawing" xmlns:w10="urn:schemas-microsoft-com:office:word" xmlns:w="http://schemas.openxmlformats.org/wordprocessingml/2006/main" xmlns:w14="http://schemas.microsoft.com/office/word/2010/wordml" xmlns:w15="http://schemas.microsoft.com/office/word/2012/wordml" xmlns:w16cex="http://schemas.microsoft.com/office/word/2018/wordml/cex" xmlns:w16cid="http://schemas.microsoft.com/office/word/2016/wordml/cid" xmlns:w16="http://schemas.microsoft.com/office/word/2018/wordml" xmlns:w16sdtdh="http://schemas.microsoft.com/office/word/2020/wordml/sdtdatahash" xmlns:w16se="http://schemas.microsoft.com/office/word/2015/wordml/symex" xmlns:wpg="http://schemas.microsoft.com/office/word/2010/wordprocessingGroup" xmlns:wpi="http://schemas.microsoft.com/office/word/2010/wordprocessingInk" xmlns:wne="http://schemas.microsoft.com/office/word/2006/wordml" xmlns:wps="http://schemas.microsoft.com/office/word/2010/wordprocessingShape" mc:Ignorable="w14 w15 w16se w16cid w16 w16cex w16sdtdh wp14">
   <w:p>
     <w:pPr>
       <w:pBdr>
@@ -1527,7 +1815,7 @@
 </file>
 
 <file path=word/footer2.xml><?xml version="1.0" encoding="utf-8"?>
-<w:ftr xmlns:wpc="http://schemas.microsoft.com/office/word/2010/wordprocessingCanvas" xmlns:mc="http://schemas.openxmlformats.org/markup-compatibility/2006" xmlns:o="urn:schemas-microsoft-com:office:office" xmlns:r="http://schemas.openxmlformats.org/officeDocument/2006/relationships" xmlns:m="http://schemas.openxmlformats.org/officeDocument/2006/math" xmlns:v="urn:schemas-microsoft-com:vml" xmlns:wp14="http://schemas.microsoft.com/office/word/2010/wordprocessingDrawing" xmlns:wp="http://schemas.openxmlformats.org/drawingml/2006/wordprocessingDrawing" xmlns:w10="urn:schemas-microsoft-com:office:word" xmlns:w="http://schemas.openxmlformats.org/wordprocessingml/2006/main" xmlns:w14="http://schemas.microsoft.com/office/word/2010/wordml" xmlns:w15="http://schemas.microsoft.com/office/word/2012/wordml" xmlns:wpg="http://schemas.microsoft.com/office/word/2010/wordprocessingGroup" xmlns:wpi="http://schemas.microsoft.com/office/word/2010/wordprocessingInk" xmlns:wne="http://schemas.microsoft.com/office/word/2006/wordml" xmlns:wps="http://schemas.microsoft.com/office/word/2010/wordprocessingShape" mc:Ignorable="w14 w15 wp14">
+<w:ftr xmlns:wpc="http://schemas.microsoft.com/office/word/2010/wordprocessingCanvas" xmlns:cx="http://schemas.microsoft.com/office/drawing/2014/chartex" xmlns:cx1="http://schemas.microsoft.com/office/drawing/2015/9/8/chartex" xmlns:cx2="http://schemas.microsoft.com/office/drawing/2015/10/21/chartex" xmlns:cx3="http://schemas.microsoft.com/office/drawing/2016/5/9/chartex" xmlns:cx4="http://schemas.microsoft.com/office/drawing/2016/5/10/chartex" xmlns:cx5="http://schemas.microsoft.com/office/drawing/2016/5/11/chartex" xmlns:cx6="http://schemas.microsoft.com/office/drawing/2016/5/12/chartex" xmlns:cx7="http://schemas.microsoft.com/office/drawing/2016/5/13/chartex" xmlns:cx8="http://schemas.microsoft.com/office/drawing/2016/5/14/chartex" xmlns:mc="http://schemas.openxmlformats.org/markup-compatibility/2006" xmlns:aink="http://schemas.microsoft.com/office/drawing/2016/ink" xmlns:am3d="http://schemas.microsoft.com/office/drawing/2017/model3d" xmlns:o="urn:schemas-microsoft-com:office:office" xmlns:oel="http://schemas.microsoft.com/office/2019/extlst" xmlns:r="http://schemas.openxmlformats.org/officeDocument/2006/relationships" xmlns:m="http://schemas.openxmlformats.org/officeDocument/2006/math" xmlns:v="urn:schemas-microsoft-com:vml" xmlns:wp14="http://schemas.microsoft.com/office/word/2010/wordprocessingDrawing" xmlns:wp="http://schemas.openxmlformats.org/drawingml/2006/wordprocessingDrawing" xmlns:w10="urn:schemas-microsoft-com:office:word" xmlns:w="http://schemas.openxmlformats.org/wordprocessingml/2006/main" xmlns:w14="http://schemas.microsoft.com/office/word/2010/wordml" xmlns:w15="http://schemas.microsoft.com/office/word/2012/wordml" xmlns:w16cex="http://schemas.microsoft.com/office/word/2018/wordml/cex" xmlns:w16cid="http://schemas.microsoft.com/office/word/2016/wordml/cid" xmlns:w16="http://schemas.microsoft.com/office/word/2018/wordml" xmlns:w16sdtdh="http://schemas.microsoft.com/office/word/2020/wordml/sdtdatahash" xmlns:w16se="http://schemas.microsoft.com/office/word/2015/wordml/symex" xmlns:wpg="http://schemas.microsoft.com/office/word/2010/wordprocessingGroup" xmlns:wpi="http://schemas.microsoft.com/office/word/2010/wordprocessingInk" xmlns:wne="http://schemas.microsoft.com/office/word/2006/wordml" xmlns:wps="http://schemas.microsoft.com/office/word/2010/wordprocessingShape" mc:Ignorable="w14 w15 w16se w16cid w16 w16cex w16sdtdh wp14">
   <w:p>
     <w:pPr>
       <w:pBdr>
@@ -1665,7 +1953,7 @@
 </file>
 
 <file path=word/footer3.xml><?xml version="1.0" encoding="utf-8"?>
-<w:ftr xmlns:wpc="http://schemas.microsoft.com/office/word/2010/wordprocessingCanvas" xmlns:mc="http://schemas.openxmlformats.org/markup-compatibility/2006" xmlns:o="urn:schemas-microsoft-com:office:office" xmlns:r="http://schemas.openxmlformats.org/officeDocument/2006/relationships" xmlns:m="http://schemas.openxmlformats.org/officeDocument/2006/math" xmlns:v="urn:schemas-microsoft-com:vml" xmlns:wp14="http://schemas.microsoft.com/office/word/2010/wordprocessingDrawing" xmlns:wp="http://schemas.openxmlformats.org/drawingml/2006/wordprocessingDrawing" xmlns:w10="urn:schemas-microsoft-com:office:word" xmlns:w="http://schemas.openxmlformats.org/wordprocessingml/2006/main" xmlns:w14="http://schemas.microsoft.com/office/word/2010/wordml" xmlns:w15="http://schemas.microsoft.com/office/word/2012/wordml" xmlns:wpg="http://schemas.microsoft.com/office/word/2010/wordprocessingGroup" xmlns:wpi="http://schemas.microsoft.com/office/word/2010/wordprocessingInk" xmlns:wne="http://schemas.microsoft.com/office/word/2006/wordml" xmlns:wps="http://schemas.microsoft.com/office/word/2010/wordprocessingShape" mc:Ignorable="w14 w15 wp14">
+<w:ftr xmlns:wpc="http://schemas.microsoft.com/office/word/2010/wordprocessingCanvas" xmlns:cx="http://schemas.microsoft.com/office/drawing/2014/chartex" xmlns:cx1="http://schemas.microsoft.com/office/drawing/2015/9/8/chartex" xmlns:cx2="http://schemas.microsoft.com/office/drawing/2015/10/21/chartex" xmlns:cx3="http://schemas.microsoft.com/office/drawing/2016/5/9/chartex" xmlns:cx4="http://schemas.microsoft.com/office/drawing/2016/5/10/chartex" xmlns:cx5="http://schemas.microsoft.com/office/drawing/2016/5/11/chartex" xmlns:cx6="http://schemas.microsoft.com/office/drawing/2016/5/12/chartex" xmlns:cx7="http://schemas.microsoft.com/office/drawing/2016/5/13/chartex" xmlns:cx8="http://schemas.microsoft.com/office/drawing/2016/5/14/chartex" xmlns:mc="http://schemas.openxmlformats.org/markup-compatibility/2006" xmlns:aink="http://schemas.microsoft.com/office/drawing/2016/ink" xmlns:am3d="http://schemas.microsoft.com/office/drawing/2017/model3d" xmlns:o="urn:schemas-microsoft-com:office:office" xmlns:oel="http://schemas.microsoft.com/office/2019/extlst" xmlns:r="http://schemas.openxmlformats.org/officeDocument/2006/relationships" xmlns:m="http://schemas.openxmlformats.org/officeDocument/2006/math" xmlns:v="urn:schemas-microsoft-com:vml" xmlns:wp14="http://schemas.microsoft.com/office/word/2010/wordprocessingDrawing" xmlns:wp="http://schemas.openxmlformats.org/drawingml/2006/wordprocessingDrawing" xmlns:w10="urn:schemas-microsoft-com:office:word" xmlns:w="http://schemas.openxmlformats.org/wordprocessingml/2006/main" xmlns:w14="http://schemas.microsoft.com/office/word/2010/wordml" xmlns:w15="http://schemas.microsoft.com/office/word/2012/wordml" xmlns:w16cex="http://schemas.microsoft.com/office/word/2018/wordml/cex" xmlns:w16cid="http://schemas.microsoft.com/office/word/2016/wordml/cid" xmlns:w16="http://schemas.microsoft.com/office/word/2018/wordml" xmlns:w16sdtdh="http://schemas.microsoft.com/office/word/2020/wordml/sdtdatahash" xmlns:w16se="http://schemas.microsoft.com/office/word/2015/wordml/symex" xmlns:wpg="http://schemas.microsoft.com/office/word/2010/wordprocessingGroup" xmlns:wpi="http://schemas.microsoft.com/office/word/2010/wordprocessingInk" xmlns:wne="http://schemas.microsoft.com/office/word/2006/wordml" xmlns:wps="http://schemas.microsoft.com/office/word/2010/wordprocessingShape" mc:Ignorable="w14 w15 w16se w16cid w16 w16cex w16sdtdh wp14">
   <w:p>
     <w:pPr>
       <w:pBdr>
@@ -1689,7 +1977,7 @@
 </file>
 
 <file path=word/footnotes.xml><?xml version="1.0" encoding="utf-8"?>
-<w:footnotes xmlns:wpc="http://schemas.microsoft.com/office/word/2010/wordprocessingCanvas" xmlns:mc="http://schemas.openxmlformats.org/markup-compatibility/2006" xmlns:o="urn:schemas-microsoft-com:office:office" xmlns:r="http://schemas.openxmlformats.org/officeDocument/2006/relationships" xmlns:m="http://schemas.openxmlformats.org/officeDocument/2006/math" xmlns:v="urn:schemas-microsoft-com:vml" xmlns:wp14="http://schemas.microsoft.com/office/word/2010/wordprocessingDrawing" xmlns:wp="http://schemas.openxmlformats.org/drawingml/2006/wordprocessingDrawing" xmlns:w10="urn:schemas-microsoft-com:office:word" xmlns:w="http://schemas.openxmlformats.org/wordprocessingml/2006/main" xmlns:w14="http://schemas.microsoft.com/office/word/2010/wordml" xmlns:w15="http://schemas.microsoft.com/office/word/2012/wordml" xmlns:wpg="http://schemas.microsoft.com/office/word/2010/wordprocessingGroup" xmlns:wpi="http://schemas.microsoft.com/office/word/2010/wordprocessingInk" xmlns:wne="http://schemas.microsoft.com/office/word/2006/wordml" xmlns:wps="http://schemas.microsoft.com/office/word/2010/wordprocessingShape" mc:Ignorable="w14 w15 wp14">
+<w:footnotes xmlns:wpc="http://schemas.microsoft.com/office/word/2010/wordprocessingCanvas" xmlns:cx="http://schemas.microsoft.com/office/drawing/2014/chartex" xmlns:cx1="http://schemas.microsoft.com/office/drawing/2015/9/8/chartex" xmlns:cx2="http://schemas.microsoft.com/office/drawing/2015/10/21/chartex" xmlns:cx3="http://schemas.microsoft.com/office/drawing/2016/5/9/chartex" xmlns:cx4="http://schemas.microsoft.com/office/drawing/2016/5/10/chartex" xmlns:cx5="http://schemas.microsoft.com/office/drawing/2016/5/11/chartex" xmlns:cx6="http://schemas.microsoft.com/office/drawing/2016/5/12/chartex" xmlns:cx7="http://schemas.microsoft.com/office/drawing/2016/5/13/chartex" xmlns:cx8="http://schemas.microsoft.com/office/drawing/2016/5/14/chartex" xmlns:mc="http://schemas.openxmlformats.org/markup-compatibility/2006" xmlns:aink="http://schemas.microsoft.com/office/drawing/2016/ink" xmlns:am3d="http://schemas.microsoft.com/office/drawing/2017/model3d" xmlns:o="urn:schemas-microsoft-com:office:office" xmlns:oel="http://schemas.microsoft.com/office/2019/extlst" xmlns:r="http://schemas.openxmlformats.org/officeDocument/2006/relationships" xmlns:m="http://schemas.openxmlformats.org/officeDocument/2006/math" xmlns:v="urn:schemas-microsoft-com:vml" xmlns:wp14="http://schemas.microsoft.com/office/word/2010/wordprocessingDrawing" xmlns:wp="http://schemas.openxmlformats.org/drawingml/2006/wordprocessingDrawing" xmlns:w10="urn:schemas-microsoft-com:office:word" xmlns:w="http://schemas.openxmlformats.org/wordprocessingml/2006/main" xmlns:w14="http://schemas.microsoft.com/office/word/2010/wordml" xmlns:w15="http://schemas.microsoft.com/office/word/2012/wordml" xmlns:w16cex="http://schemas.microsoft.com/office/word/2018/wordml/cex" xmlns:w16cid="http://schemas.microsoft.com/office/word/2016/wordml/cid" xmlns:w16="http://schemas.microsoft.com/office/word/2018/wordml" xmlns:w16sdtdh="http://schemas.microsoft.com/office/word/2020/wordml/sdtdatahash" xmlns:w16se="http://schemas.microsoft.com/office/word/2015/wordml/symex" xmlns:wpg="http://schemas.microsoft.com/office/word/2010/wordprocessingGroup" xmlns:wpi="http://schemas.microsoft.com/office/word/2010/wordprocessingInk" xmlns:wne="http://schemas.microsoft.com/office/word/2006/wordml" xmlns:wps="http://schemas.microsoft.com/office/word/2010/wordprocessingShape" mc:Ignorable="w14 w15 w16se w16cid w16 w16cex w16sdtdh wp14">
   <w:footnote w:type="separator" w:id="-1">
     <w:p>
       <w:pPr>
@@ -1714,7 +2002,7 @@
 </file>
 
 <file path=word/header1.xml><?xml version="1.0" encoding="utf-8"?>
-<w:hdr xmlns:wpc="http://schemas.microsoft.com/office/word/2010/wordprocessingCanvas" xmlns:mc="http://schemas.openxmlformats.org/markup-compatibility/2006" xmlns:o="urn:schemas-microsoft-com:office:office" xmlns:r="http://schemas.openxmlformats.org/officeDocument/2006/relationships" xmlns:m="http://schemas.openxmlformats.org/officeDocument/2006/math" xmlns:v="urn:schemas-microsoft-com:vml" xmlns:wp14="http://schemas.microsoft.com/office/word/2010/wordprocessingDrawing" xmlns:wp="http://schemas.openxmlformats.org/drawingml/2006/wordprocessingDrawing" xmlns:w10="urn:schemas-microsoft-com:office:word" xmlns:w="http://schemas.openxmlformats.org/wordprocessingml/2006/main" xmlns:w14="http://schemas.microsoft.com/office/word/2010/wordml" xmlns:w15="http://schemas.microsoft.com/office/word/2012/wordml" xmlns:wpg="http://schemas.microsoft.com/office/word/2010/wordprocessingGroup" xmlns:wpi="http://schemas.microsoft.com/office/word/2010/wordprocessingInk" xmlns:wne="http://schemas.microsoft.com/office/word/2006/wordml" xmlns:wps="http://schemas.microsoft.com/office/word/2010/wordprocessingShape" mc:Ignorable="w14 w15 wp14">
+<w:hdr xmlns:wpc="http://schemas.microsoft.com/office/word/2010/wordprocessingCanvas" xmlns:cx="http://schemas.microsoft.com/office/drawing/2014/chartex" xmlns:cx1="http://schemas.microsoft.com/office/drawing/2015/9/8/chartex" xmlns:cx2="http://schemas.microsoft.com/office/drawing/2015/10/21/chartex" xmlns:cx3="http://schemas.microsoft.com/office/drawing/2016/5/9/chartex" xmlns:cx4="http://schemas.microsoft.com/office/drawing/2016/5/10/chartex" xmlns:cx5="http://schemas.microsoft.com/office/drawing/2016/5/11/chartex" xmlns:cx6="http://schemas.microsoft.com/office/drawing/2016/5/12/chartex" xmlns:cx7="http://schemas.microsoft.com/office/drawing/2016/5/13/chartex" xmlns:cx8="http://schemas.microsoft.com/office/drawing/2016/5/14/chartex" xmlns:mc="http://schemas.openxmlformats.org/markup-compatibility/2006" xmlns:aink="http://schemas.microsoft.com/office/drawing/2016/ink" xmlns:am3d="http://schemas.microsoft.com/office/drawing/2017/model3d" xmlns:o="urn:schemas-microsoft-com:office:office" xmlns:oel="http://schemas.microsoft.com/office/2019/extlst" xmlns:r="http://schemas.openxmlformats.org/officeDocument/2006/relationships" xmlns:m="http://schemas.openxmlformats.org/officeDocument/2006/math" xmlns:v="urn:schemas-microsoft-com:vml" xmlns:wp14="http://schemas.microsoft.com/office/word/2010/wordprocessingDrawing" xmlns:wp="http://schemas.openxmlformats.org/drawingml/2006/wordprocessingDrawing" xmlns:w10="urn:schemas-microsoft-com:office:word" xmlns:w="http://schemas.openxmlformats.org/wordprocessingml/2006/main" xmlns:w14="http://schemas.microsoft.com/office/word/2010/wordml" xmlns:w15="http://schemas.microsoft.com/office/word/2012/wordml" xmlns:w16cex="http://schemas.microsoft.com/office/word/2018/wordml/cex" xmlns:w16cid="http://schemas.microsoft.com/office/word/2016/wordml/cid" xmlns:w16="http://schemas.microsoft.com/office/word/2018/wordml" xmlns:w16sdtdh="http://schemas.microsoft.com/office/word/2020/wordml/sdtdatahash" xmlns:w16se="http://schemas.microsoft.com/office/word/2015/wordml/symex" xmlns:wpg="http://schemas.microsoft.com/office/word/2010/wordprocessingGroup" xmlns:wpi="http://schemas.microsoft.com/office/word/2010/wordprocessingInk" xmlns:wne="http://schemas.microsoft.com/office/word/2006/wordml" xmlns:wps="http://schemas.microsoft.com/office/word/2010/wordprocessingShape" mc:Ignorable="w14 w15 w16se w16cid w16 w16cex w16sdtdh wp14">
   <w:p>
     <w:pPr>
       <w:pBdr>
@@ -1738,7 +2026,7 @@
 </file>
 
 <file path=word/header2.xml><?xml version="1.0" encoding="utf-8"?>
-<w:hdr xmlns:wpc="http://schemas.microsoft.com/office/word/2010/wordprocessingCanvas" xmlns:mc="http://schemas.openxmlformats.org/markup-compatibility/2006" xmlns:o="urn:schemas-microsoft-com:office:office" xmlns:r="http://schemas.openxmlformats.org/officeDocument/2006/relationships" xmlns:m="http://schemas.openxmlformats.org/officeDocument/2006/math" xmlns:v="urn:schemas-microsoft-com:vml" xmlns:wp14="http://schemas.microsoft.com/office/word/2010/wordprocessingDrawing" xmlns:wp="http://schemas.openxmlformats.org/drawingml/2006/wordprocessingDrawing" xmlns:w10="urn:schemas-microsoft-com:office:word" xmlns:w="http://schemas.openxmlformats.org/wordprocessingml/2006/main" xmlns:w14="http://schemas.microsoft.com/office/word/2010/wordml" xmlns:w15="http://schemas.microsoft.com/office/word/2012/wordml" xmlns:wpg="http://schemas.microsoft.com/office/word/2010/wordprocessingGroup" xmlns:wpi="http://schemas.microsoft.com/office/word/2010/wordprocessingInk" xmlns:wne="http://schemas.microsoft.com/office/word/2006/wordml" xmlns:wps="http://schemas.microsoft.com/office/word/2010/wordprocessingShape" mc:Ignorable="w14 w15 wp14">
+<w:hdr xmlns:wpc="http://schemas.microsoft.com/office/word/2010/wordprocessingCanvas" xmlns:cx="http://schemas.microsoft.com/office/drawing/2014/chartex" xmlns:cx1="http://schemas.microsoft.com/office/drawing/2015/9/8/chartex" xmlns:cx2="http://schemas.microsoft.com/office/drawing/2015/10/21/chartex" xmlns:cx3="http://schemas.microsoft.com/office/drawing/2016/5/9/chartex" xmlns:cx4="http://schemas.microsoft.com/office/drawing/2016/5/10/chartex" xmlns:cx5="http://schemas.microsoft.com/office/drawing/2016/5/11/chartex" xmlns:cx6="http://schemas.microsoft.com/office/drawing/2016/5/12/chartex" xmlns:cx7="http://schemas.microsoft.com/office/drawing/2016/5/13/chartex" xmlns:cx8="http://schemas.microsoft.com/office/drawing/2016/5/14/chartex" xmlns:mc="http://schemas.openxmlformats.org/markup-compatibility/2006" xmlns:aink="http://schemas.microsoft.com/office/drawing/2016/ink" xmlns:am3d="http://schemas.microsoft.com/office/drawing/2017/model3d" xmlns:o="urn:schemas-microsoft-com:office:office" xmlns:oel="http://schemas.microsoft.com/office/2019/extlst" xmlns:r="http://schemas.openxmlformats.org/officeDocument/2006/relationships" xmlns:m="http://schemas.openxmlformats.org/officeDocument/2006/math" xmlns:v="urn:schemas-microsoft-com:vml" xmlns:wp14="http://schemas.microsoft.com/office/word/2010/wordprocessingDrawing" xmlns:wp="http://schemas.openxmlformats.org/drawingml/2006/wordprocessingDrawing" xmlns:w10="urn:schemas-microsoft-com:office:word" xmlns:w="http://schemas.openxmlformats.org/wordprocessingml/2006/main" xmlns:w14="http://schemas.microsoft.com/office/word/2010/wordml" xmlns:w15="http://schemas.microsoft.com/office/word/2012/wordml" xmlns:w16cex="http://schemas.microsoft.com/office/word/2018/wordml/cex" xmlns:w16cid="http://schemas.microsoft.com/office/word/2016/wordml/cid" xmlns:w16="http://schemas.microsoft.com/office/word/2018/wordml" xmlns:w16sdtdh="http://schemas.microsoft.com/office/word/2020/wordml/sdtdatahash" xmlns:w16se="http://schemas.microsoft.com/office/word/2015/wordml/symex" xmlns:wpg="http://schemas.microsoft.com/office/word/2010/wordprocessingGroup" xmlns:wpi="http://schemas.microsoft.com/office/word/2010/wordprocessingInk" xmlns:wne="http://schemas.microsoft.com/office/word/2006/wordml" xmlns:wps="http://schemas.microsoft.com/office/word/2010/wordprocessingShape" mc:Ignorable="w14 w15 w16se w16cid w16 w16cex w16sdtdh wp14">
   <w:p>
     <w:pPr>
       <w:pBdr>
@@ -1766,7 +2054,7 @@
 </file>
 
 <file path=word/header3.xml><?xml version="1.0" encoding="utf-8"?>
-<w:hdr xmlns:wpc="http://schemas.microsoft.com/office/word/2010/wordprocessingCanvas" xmlns:mc="http://schemas.openxmlformats.org/markup-compatibility/2006" xmlns:o="urn:schemas-microsoft-com:office:office" xmlns:r="http://schemas.openxmlformats.org/officeDocument/2006/relationships" xmlns:m="http://schemas.openxmlformats.org/officeDocument/2006/math" xmlns:v="urn:schemas-microsoft-com:vml" xmlns:wp14="http://schemas.microsoft.com/office/word/2010/wordprocessingDrawing" xmlns:wp="http://schemas.openxmlformats.org/drawingml/2006/wordprocessingDrawing" xmlns:w10="urn:schemas-microsoft-com:office:word" xmlns:w="http://schemas.openxmlformats.org/wordprocessingml/2006/main" xmlns:w14="http://schemas.microsoft.com/office/word/2010/wordml" xmlns:w15="http://schemas.microsoft.com/office/word/2012/wordml" xmlns:wpg="http://schemas.microsoft.com/office/word/2010/wordprocessingGroup" xmlns:wpi="http://schemas.microsoft.com/office/word/2010/wordprocessingInk" xmlns:wne="http://schemas.microsoft.com/office/word/2006/wordml" xmlns:wps="http://schemas.microsoft.com/office/word/2010/wordprocessingShape" mc:Ignorable="w14 w15 wp14">
+<w:hdr xmlns:wpc="http://schemas.microsoft.com/office/word/2010/wordprocessingCanvas" xmlns:cx="http://schemas.microsoft.com/office/drawing/2014/chartex" xmlns:cx1="http://schemas.microsoft.com/office/drawing/2015/9/8/chartex" xmlns:cx2="http://schemas.microsoft.com/office/drawing/2015/10/21/chartex" xmlns:cx3="http://schemas.microsoft.com/office/drawing/2016/5/9/chartex" xmlns:cx4="http://schemas.microsoft.com/office/drawing/2016/5/10/chartex" xmlns:cx5="http://schemas.microsoft.com/office/drawing/2016/5/11/chartex" xmlns:cx6="http://schemas.microsoft.com/office/drawing/2016/5/12/chartex" xmlns:cx7="http://schemas.microsoft.com/office/drawing/2016/5/13/chartex" xmlns:cx8="http://schemas.microsoft.com/office/drawing/2016/5/14/chartex" xmlns:mc="http://schemas.openxmlformats.org/markup-compatibility/2006" xmlns:aink="http://schemas.microsoft.com/office/drawing/2016/ink" xmlns:am3d="http://schemas.microsoft.com/office/drawing/2017/model3d" xmlns:o="urn:schemas-microsoft-com:office:office" xmlns:oel="http://schemas.microsoft.com/office/2019/extlst" xmlns:r="http://schemas.openxmlformats.org/officeDocument/2006/relationships" xmlns:m="http://schemas.openxmlformats.org/officeDocument/2006/math" xmlns:v="urn:schemas-microsoft-com:vml" xmlns:wp14="http://schemas.microsoft.com/office/word/2010/wordprocessingDrawing" xmlns:wp="http://schemas.openxmlformats.org/drawingml/2006/wordprocessingDrawing" xmlns:w10="urn:schemas-microsoft-com:office:word" xmlns:w="http://schemas.openxmlformats.org/wordprocessingml/2006/main" xmlns:w14="http://schemas.microsoft.com/office/word/2010/wordml" xmlns:w15="http://schemas.microsoft.com/office/word/2012/wordml" xmlns:w16cex="http://schemas.microsoft.com/office/word/2018/wordml/cex" xmlns:w16cid="http://schemas.microsoft.com/office/word/2016/wordml/cid" xmlns:w16="http://schemas.microsoft.com/office/word/2018/wordml" xmlns:w16sdtdh="http://schemas.microsoft.com/office/word/2020/wordml/sdtdatahash" xmlns:w16se="http://schemas.microsoft.com/office/word/2015/wordml/symex" xmlns:wpg="http://schemas.microsoft.com/office/word/2010/wordprocessingGroup" xmlns:wpi="http://schemas.microsoft.com/office/word/2010/wordprocessingInk" xmlns:wne="http://schemas.microsoft.com/office/word/2006/wordml" xmlns:wps="http://schemas.microsoft.com/office/word/2010/wordprocessingShape" mc:Ignorable="w14 w15 w16se w16cid w16 w16cex w16sdtdh wp14">
   <w:p>
     <w:pPr>
       <w:pBdr>
@@ -1790,8 +2078,8 @@
 </file>
 
 <file path=word/numbering.xml><?xml version="1.0" encoding="utf-8"?>
-<w:numbering xmlns:wpc="http://schemas.microsoft.com/office/word/2010/wordprocessingCanvas" xmlns:mc="http://schemas.openxmlformats.org/markup-compatibility/2006" xmlns:o="urn:schemas-microsoft-com:office:office" xmlns:r="http://schemas.openxmlformats.org/officeDocument/2006/relationships" xmlns:m="http://schemas.openxmlformats.org/officeDocument/2006/math" xmlns:v="urn:schemas-microsoft-com:vml" xmlns:wp14="http://schemas.microsoft.com/office/word/2010/wordprocessingDrawing" xmlns:wp="http://schemas.openxmlformats.org/drawingml/2006/wordprocessingDrawing" xmlns:w10="urn:schemas-microsoft-com:office:word" xmlns:w="http://schemas.openxmlformats.org/wordprocessingml/2006/main" xmlns:w14="http://schemas.microsoft.com/office/word/2010/wordml" xmlns:w15="http://schemas.microsoft.com/office/word/2012/wordml" xmlns:wpg="http://schemas.microsoft.com/office/word/2010/wordprocessingGroup" xmlns:wpi="http://schemas.microsoft.com/office/word/2010/wordprocessingInk" xmlns:wne="http://schemas.microsoft.com/office/word/2006/wordml" xmlns:wps="http://schemas.microsoft.com/office/word/2010/wordprocessingShape" mc:Ignorable="w14 w15 wp14">
-  <w:abstractNum w:abstractNumId="0">
+<w:numbering xmlns:wpc="http://schemas.microsoft.com/office/word/2010/wordprocessingCanvas" xmlns:cx="http://schemas.microsoft.com/office/drawing/2014/chartex" xmlns:cx1="http://schemas.microsoft.com/office/drawing/2015/9/8/chartex" xmlns:cx2="http://schemas.microsoft.com/office/drawing/2015/10/21/chartex" xmlns:cx3="http://schemas.microsoft.com/office/drawing/2016/5/9/chartex" xmlns:cx4="http://schemas.microsoft.com/office/drawing/2016/5/10/chartex" xmlns:cx5="http://schemas.microsoft.com/office/drawing/2016/5/11/chartex" xmlns:cx6="http://schemas.microsoft.com/office/drawing/2016/5/12/chartex" xmlns:cx7="http://schemas.microsoft.com/office/drawing/2016/5/13/chartex" xmlns:cx8="http://schemas.microsoft.com/office/drawing/2016/5/14/chartex" xmlns:mc="http://schemas.openxmlformats.org/markup-compatibility/2006" xmlns:aink="http://schemas.microsoft.com/office/drawing/2016/ink" xmlns:am3d="http://schemas.microsoft.com/office/drawing/2017/model3d" xmlns:o="urn:schemas-microsoft-com:office:office" xmlns:oel="http://schemas.microsoft.com/office/2019/extlst" xmlns:r="http://schemas.openxmlformats.org/officeDocument/2006/relationships" xmlns:m="http://schemas.openxmlformats.org/officeDocument/2006/math" xmlns:v="urn:schemas-microsoft-com:vml" xmlns:wp14="http://schemas.microsoft.com/office/word/2010/wordprocessingDrawing" xmlns:wp="http://schemas.openxmlformats.org/drawingml/2006/wordprocessingDrawing" xmlns:w10="urn:schemas-microsoft-com:office:word" xmlns:w="http://schemas.openxmlformats.org/wordprocessingml/2006/main" xmlns:w14="http://schemas.microsoft.com/office/word/2010/wordml" xmlns:w15="http://schemas.microsoft.com/office/word/2012/wordml" xmlns:w16cex="http://schemas.microsoft.com/office/word/2018/wordml/cex" xmlns:w16cid="http://schemas.microsoft.com/office/word/2016/wordml/cid" xmlns:w16="http://schemas.microsoft.com/office/word/2018/wordml" xmlns:w16sdtdh="http://schemas.microsoft.com/office/word/2020/wordml/sdtdatahash" xmlns:w16se="http://schemas.microsoft.com/office/word/2015/wordml/symex" xmlns:wpg="http://schemas.microsoft.com/office/word/2010/wordprocessingGroup" xmlns:wpi="http://schemas.microsoft.com/office/word/2010/wordprocessingInk" xmlns:wne="http://schemas.microsoft.com/office/word/2006/wordml" xmlns:wps="http://schemas.microsoft.com/office/word/2010/wordprocessingShape" mc:Ignorable="w14 w15 w16se w16cid w16 w16cex w16sdtdh wp14">
+  <w:abstractNum w:abstractNumId="0" w15:restartNumberingAfterBreak="0">
     <w:nsid w:val="014A1FAD"/>
     <w:multiLevelType w:val="multilevel"/>
     <w:tmpl w:val="C84EF6D0"/>
@@ -1940,7 +2228,7 @@
       </w:rPr>
     </w:lvl>
   </w:abstractNum>
-  <w:abstractNum w:abstractNumId="1">
+  <w:abstractNum w:abstractNumId="1" w15:restartNumberingAfterBreak="0">
     <w:nsid w:val="029662B4"/>
     <w:multiLevelType w:val="multilevel"/>
     <w:tmpl w:val="9CFC1BB2"/>
@@ -2089,7 +2377,7 @@
       </w:rPr>
     </w:lvl>
   </w:abstractNum>
-  <w:abstractNum w:abstractNumId="2">
+  <w:abstractNum w:abstractNumId="2" w15:restartNumberingAfterBreak="0">
     <w:nsid w:val="0CEB3729"/>
     <w:multiLevelType w:val="multilevel"/>
     <w:tmpl w:val="E0468052"/>
@@ -2238,7 +2526,7 @@
       </w:rPr>
     </w:lvl>
   </w:abstractNum>
-  <w:abstractNum w:abstractNumId="3">
+  <w:abstractNum w:abstractNumId="3" w15:restartNumberingAfterBreak="0">
     <w:nsid w:val="0D714FA8"/>
     <w:multiLevelType w:val="multilevel"/>
     <w:tmpl w:val="4FD40DC4"/>
@@ -2387,7 +2675,7 @@
       </w:rPr>
     </w:lvl>
   </w:abstractNum>
-  <w:abstractNum w:abstractNumId="4">
+  <w:abstractNum w:abstractNumId="4" w15:restartNumberingAfterBreak="0">
     <w:nsid w:val="0F794E06"/>
     <w:multiLevelType w:val="multilevel"/>
     <w:tmpl w:val="13D887C8"/>
@@ -2536,7 +2824,7 @@
       </w:rPr>
     </w:lvl>
   </w:abstractNum>
-  <w:abstractNum w:abstractNumId="5">
+  <w:abstractNum w:abstractNumId="5" w15:restartNumberingAfterBreak="0">
     <w:nsid w:val="109143F6"/>
     <w:multiLevelType w:val="multilevel"/>
     <w:tmpl w:val="FB6AB6F4"/>
@@ -2685,7 +2973,7 @@
       </w:rPr>
     </w:lvl>
   </w:abstractNum>
-  <w:abstractNum w:abstractNumId="6">
+  <w:abstractNum w:abstractNumId="6" w15:restartNumberingAfterBreak="0">
     <w:nsid w:val="1A387F83"/>
     <w:multiLevelType w:val="multilevel"/>
     <w:tmpl w:val="102A9808"/>
@@ -2834,7 +3122,7 @@
       </w:rPr>
     </w:lvl>
   </w:abstractNum>
-  <w:abstractNum w:abstractNumId="7">
+  <w:abstractNum w:abstractNumId="7" w15:restartNumberingAfterBreak="0">
     <w:nsid w:val="1DE34262"/>
     <w:multiLevelType w:val="multilevel"/>
     <w:tmpl w:val="C7861610"/>
@@ -2983,7 +3271,7 @@
       </w:rPr>
     </w:lvl>
   </w:abstractNum>
-  <w:abstractNum w:abstractNumId="8">
+  <w:abstractNum w:abstractNumId="8" w15:restartNumberingAfterBreak="0">
     <w:nsid w:val="28335BA2"/>
     <w:multiLevelType w:val="multilevel"/>
     <w:tmpl w:val="32124FCC"/>
@@ -3132,7 +3420,7 @@
       </w:rPr>
     </w:lvl>
   </w:abstractNum>
-  <w:abstractNum w:abstractNumId="9">
+  <w:abstractNum w:abstractNumId="9" w15:restartNumberingAfterBreak="0">
     <w:nsid w:val="28F6193C"/>
     <w:multiLevelType w:val="multilevel"/>
     <w:tmpl w:val="83BE99A4"/>
@@ -3281,7 +3569,7 @@
       </w:rPr>
     </w:lvl>
   </w:abstractNum>
-  <w:abstractNum w:abstractNumId="10">
+  <w:abstractNum w:abstractNumId="10" w15:restartNumberingAfterBreak="0">
     <w:nsid w:val="2AD73EDF"/>
     <w:multiLevelType w:val="multilevel"/>
     <w:tmpl w:val="523419CE"/>
@@ -3430,7 +3718,7 @@
       </w:rPr>
     </w:lvl>
   </w:abstractNum>
-  <w:abstractNum w:abstractNumId="11">
+  <w:abstractNum w:abstractNumId="11" w15:restartNumberingAfterBreak="0">
     <w:nsid w:val="2FE92C5E"/>
     <w:multiLevelType w:val="multilevel"/>
     <w:tmpl w:val="AF665276"/>
@@ -3579,7 +3867,7 @@
       </w:rPr>
     </w:lvl>
   </w:abstractNum>
-  <w:abstractNum w:abstractNumId="12">
+  <w:abstractNum w:abstractNumId="12" w15:restartNumberingAfterBreak="0">
     <w:nsid w:val="3344749E"/>
     <w:multiLevelType w:val="multilevel"/>
     <w:tmpl w:val="581EE46E"/>
@@ -3728,7 +4016,7 @@
       </w:rPr>
     </w:lvl>
   </w:abstractNum>
-  <w:abstractNum w:abstractNumId="13">
+  <w:abstractNum w:abstractNumId="13" w15:restartNumberingAfterBreak="0">
     <w:nsid w:val="38C51E7C"/>
     <w:multiLevelType w:val="multilevel"/>
     <w:tmpl w:val="75C6CF1E"/>
@@ -3877,7 +4165,120 @@
       </w:rPr>
     </w:lvl>
   </w:abstractNum>
-  <w:abstractNum w:abstractNumId="14">
+  <w:abstractNum w:abstractNumId="14" w15:restartNumberingAfterBreak="0">
+    <w:nsid w:val="3C50051B"/>
+    <w:multiLevelType w:val="hybridMultilevel"/>
+    <w:tmpl w:val="01707552"/>
+    <w:lvl w:ilvl="0" w:tplc="04160001">
+      <w:start w:val="1"/>
+      <w:numFmt w:val="bullet"/>
+      <w:lvlText w:val=""/>
+      <w:lvlJc w:val="left"/>
+      <w:pPr>
+        <w:ind w:left="720" w:hanging="360"/>
+      </w:pPr>
+      <w:rPr>
+        <w:rFonts w:ascii="Symbol" w:hAnsi="Symbol" w:hint="default"/>
+      </w:rPr>
+    </w:lvl>
+    <w:lvl w:ilvl="1" w:tplc="04160003" w:tentative="1">
+      <w:start w:val="1"/>
+      <w:numFmt w:val="bullet"/>
+      <w:lvlText w:val="o"/>
+      <w:lvlJc w:val="left"/>
+      <w:pPr>
+        <w:ind w:left="1440" w:hanging="360"/>
+      </w:pPr>
+      <w:rPr>
+        <w:rFonts w:ascii="Courier New" w:hAnsi="Courier New" w:cs="Courier New" w:hint="default"/>
+      </w:rPr>
+    </w:lvl>
+    <w:lvl w:ilvl="2" w:tplc="04160005" w:tentative="1">
+      <w:start w:val="1"/>
+      <w:numFmt w:val="bullet"/>
+      <w:lvlText w:val=""/>
+      <w:lvlJc w:val="left"/>
+      <w:pPr>
+        <w:ind w:left="2160" w:hanging="360"/>
+      </w:pPr>
+      <w:rPr>
+        <w:rFonts w:ascii="Wingdings" w:hAnsi="Wingdings" w:hint="default"/>
+      </w:rPr>
+    </w:lvl>
+    <w:lvl w:ilvl="3" w:tplc="04160001" w:tentative="1">
+      <w:start w:val="1"/>
+      <w:numFmt w:val="bullet"/>
+      <w:lvlText w:val=""/>
+      <w:lvlJc w:val="left"/>
+      <w:pPr>
+        <w:ind w:left="2880" w:hanging="360"/>
+      </w:pPr>
+      <w:rPr>
+        <w:rFonts w:ascii="Symbol" w:hAnsi="Symbol" w:hint="default"/>
+      </w:rPr>
+    </w:lvl>
+    <w:lvl w:ilvl="4" w:tplc="04160003" w:tentative="1">
+      <w:start w:val="1"/>
+      <w:numFmt w:val="bullet"/>
+      <w:lvlText w:val="o"/>
+      <w:lvlJc w:val="left"/>
+      <w:pPr>
+        <w:ind w:left="3600" w:hanging="360"/>
+      </w:pPr>
+      <w:rPr>
+        <w:rFonts w:ascii="Courier New" w:hAnsi="Courier New" w:cs="Courier New" w:hint="default"/>
+      </w:rPr>
+    </w:lvl>
+    <w:lvl w:ilvl="5" w:tplc="04160005" w:tentative="1">
+      <w:start w:val="1"/>
+      <w:numFmt w:val="bullet"/>
+      <w:lvlText w:val=""/>
+      <w:lvlJc w:val="left"/>
+      <w:pPr>
+        <w:ind w:left="4320" w:hanging="360"/>
+      </w:pPr>
+      <w:rPr>
+        <w:rFonts w:ascii="Wingdings" w:hAnsi="Wingdings" w:hint="default"/>
+      </w:rPr>
+    </w:lvl>
+    <w:lvl w:ilvl="6" w:tplc="04160001" w:tentative="1">
+      <w:start w:val="1"/>
+      <w:numFmt w:val="bullet"/>
+      <w:lvlText w:val=""/>
+      <w:lvlJc w:val="left"/>
+      <w:pPr>
+        <w:ind w:left="5040" w:hanging="360"/>
+      </w:pPr>
+      <w:rPr>
+        <w:rFonts w:ascii="Symbol" w:hAnsi="Symbol" w:hint="default"/>
+      </w:rPr>
+    </w:lvl>
+    <w:lvl w:ilvl="7" w:tplc="04160003" w:tentative="1">
+      <w:start w:val="1"/>
+      <w:numFmt w:val="bullet"/>
+      <w:lvlText w:val="o"/>
+      <w:lvlJc w:val="left"/>
+      <w:pPr>
+        <w:ind w:left="5760" w:hanging="360"/>
+      </w:pPr>
+      <w:rPr>
+        <w:rFonts w:ascii="Courier New" w:hAnsi="Courier New" w:cs="Courier New" w:hint="default"/>
+      </w:rPr>
+    </w:lvl>
+    <w:lvl w:ilvl="8" w:tplc="04160005" w:tentative="1">
+      <w:start w:val="1"/>
+      <w:numFmt w:val="bullet"/>
+      <w:lvlText w:val=""/>
+      <w:lvlJc w:val="left"/>
+      <w:pPr>
+        <w:ind w:left="6480" w:hanging="360"/>
+      </w:pPr>
+      <w:rPr>
+        <w:rFonts w:ascii="Wingdings" w:hAnsi="Wingdings" w:hint="default"/>
+      </w:rPr>
+    </w:lvl>
+  </w:abstractNum>
+  <w:abstractNum w:abstractNumId="15" w15:restartNumberingAfterBreak="0">
     <w:nsid w:val="3D7A27B8"/>
     <w:multiLevelType w:val="multilevel"/>
     <w:tmpl w:val="D1983D1A"/>
@@ -4026,7 +4427,7 @@
       </w:rPr>
     </w:lvl>
   </w:abstractNum>
-  <w:abstractNum w:abstractNumId="15">
+  <w:abstractNum w:abstractNumId="16" w15:restartNumberingAfterBreak="0">
     <w:nsid w:val="4051330B"/>
     <w:multiLevelType w:val="multilevel"/>
     <w:tmpl w:val="BAD06B2C"/>
@@ -4175,7 +4576,7 @@
       </w:rPr>
     </w:lvl>
   </w:abstractNum>
-  <w:abstractNum w:abstractNumId="16">
+  <w:abstractNum w:abstractNumId="17" w15:restartNumberingAfterBreak="0">
     <w:nsid w:val="46795B27"/>
     <w:multiLevelType w:val="multilevel"/>
     <w:tmpl w:val="3D9E3768"/>
@@ -4324,7 +4725,156 @@
       </w:rPr>
     </w:lvl>
   </w:abstractNum>
-  <w:abstractNum w:abstractNumId="17">
+  <w:abstractNum w:abstractNumId="18" w15:restartNumberingAfterBreak="0">
+    <w:nsid w:val="47EB3F9A"/>
+    <w:multiLevelType w:val="multilevel"/>
+    <w:tmpl w:val="86D416DA"/>
+    <w:lvl w:ilvl="0">
+      <w:start w:val="1"/>
+      <w:numFmt w:val="bullet"/>
+      <w:lvlText w:val=""/>
+      <w:lvlJc w:val="left"/>
+      <w:pPr>
+        <w:tabs>
+          <w:tab w:val="num" w:pos="720"/>
+        </w:tabs>
+        <w:ind w:left="720" w:hanging="360"/>
+      </w:pPr>
+      <w:rPr>
+        <w:rFonts w:ascii="Symbol" w:hAnsi="Symbol" w:hint="default"/>
+        <w:sz w:val="20"/>
+      </w:rPr>
+    </w:lvl>
+    <w:lvl w:ilvl="1">
+      <w:start w:val="1"/>
+      <w:numFmt w:val="bullet"/>
+      <w:lvlText w:val="o"/>
+      <w:lvlJc w:val="left"/>
+      <w:pPr>
+        <w:tabs>
+          <w:tab w:val="num" w:pos="1440"/>
+        </w:tabs>
+        <w:ind w:left="1440" w:hanging="360"/>
+      </w:pPr>
+      <w:rPr>
+        <w:rFonts w:ascii="Courier New" w:hAnsi="Courier New" w:hint="default"/>
+        <w:sz w:val="20"/>
+      </w:rPr>
+    </w:lvl>
+    <w:lvl w:ilvl="2" w:tentative="1">
+      <w:start w:val="1"/>
+      <w:numFmt w:val="bullet"/>
+      <w:lvlText w:val=""/>
+      <w:lvlJc w:val="left"/>
+      <w:pPr>
+        <w:tabs>
+          <w:tab w:val="num" w:pos="2160"/>
+        </w:tabs>
+        <w:ind w:left="2160" w:hanging="360"/>
+      </w:pPr>
+      <w:rPr>
+        <w:rFonts w:ascii="Wingdings" w:hAnsi="Wingdings" w:hint="default"/>
+        <w:sz w:val="20"/>
+      </w:rPr>
+    </w:lvl>
+    <w:lvl w:ilvl="3" w:tentative="1">
+      <w:start w:val="1"/>
+      <w:numFmt w:val="bullet"/>
+      <w:lvlText w:val=""/>
+      <w:lvlJc w:val="left"/>
+      <w:pPr>
+        <w:tabs>
+          <w:tab w:val="num" w:pos="2880"/>
+        </w:tabs>
+        <w:ind w:left="2880" w:hanging="360"/>
+      </w:pPr>
+      <w:rPr>
+        <w:rFonts w:ascii="Wingdings" w:hAnsi="Wingdings" w:hint="default"/>
+        <w:sz w:val="20"/>
+      </w:rPr>
+    </w:lvl>
+    <w:lvl w:ilvl="4" w:tentative="1">
+      <w:start w:val="1"/>
+      <w:numFmt w:val="bullet"/>
+      <w:lvlText w:val=""/>
+      <w:lvlJc w:val="left"/>
+      <w:pPr>
+        <w:tabs>
+          <w:tab w:val="num" w:pos="3600"/>
+        </w:tabs>
+        <w:ind w:left="3600" w:hanging="360"/>
+      </w:pPr>
+      <w:rPr>
+        <w:rFonts w:ascii="Wingdings" w:hAnsi="Wingdings" w:hint="default"/>
+        <w:sz w:val="20"/>
+      </w:rPr>
+    </w:lvl>
+    <w:lvl w:ilvl="5" w:tentative="1">
+      <w:start w:val="1"/>
+      <w:numFmt w:val="bullet"/>
+      <w:lvlText w:val=""/>
+      <w:lvlJc w:val="left"/>
+      <w:pPr>
+        <w:tabs>
+          <w:tab w:val="num" w:pos="4320"/>
+        </w:tabs>
+        <w:ind w:left="4320" w:hanging="360"/>
+      </w:pPr>
+      <w:rPr>
+        <w:rFonts w:ascii="Wingdings" w:hAnsi="Wingdings" w:hint="default"/>
+        <w:sz w:val="20"/>
+      </w:rPr>
+    </w:lvl>
+    <w:lvl w:ilvl="6" w:tentative="1">
+      <w:start w:val="1"/>
+      <w:numFmt w:val="bullet"/>
+      <w:lvlText w:val=""/>
+      <w:lvlJc w:val="left"/>
+      <w:pPr>
+        <w:tabs>
+          <w:tab w:val="num" w:pos="5040"/>
+        </w:tabs>
+        <w:ind w:left="5040" w:hanging="360"/>
+      </w:pPr>
+      <w:rPr>
+        <w:rFonts w:ascii="Wingdings" w:hAnsi="Wingdings" w:hint="default"/>
+        <w:sz w:val="20"/>
+      </w:rPr>
+    </w:lvl>
+    <w:lvl w:ilvl="7" w:tentative="1">
+      <w:start w:val="1"/>
+      <w:numFmt w:val="bullet"/>
+      <w:lvlText w:val=""/>
+      <w:lvlJc w:val="left"/>
+      <w:pPr>
+        <w:tabs>
+          <w:tab w:val="num" w:pos="5760"/>
+        </w:tabs>
+        <w:ind w:left="5760" w:hanging="360"/>
+      </w:pPr>
+      <w:rPr>
+        <w:rFonts w:ascii="Wingdings" w:hAnsi="Wingdings" w:hint="default"/>
+        <w:sz w:val="20"/>
+      </w:rPr>
+    </w:lvl>
+    <w:lvl w:ilvl="8" w:tentative="1">
+      <w:start w:val="1"/>
+      <w:numFmt w:val="bullet"/>
+      <w:lvlText w:val=""/>
+      <w:lvlJc w:val="left"/>
+      <w:pPr>
+        <w:tabs>
+          <w:tab w:val="num" w:pos="6480"/>
+        </w:tabs>
+        <w:ind w:left="6480" w:hanging="360"/>
+      </w:pPr>
+      <w:rPr>
+        <w:rFonts w:ascii="Wingdings" w:hAnsi="Wingdings" w:hint="default"/>
+        <w:sz w:val="20"/>
+      </w:rPr>
+    </w:lvl>
+  </w:abstractNum>
+  <w:abstractNum w:abstractNumId="19" w15:restartNumberingAfterBreak="0">
     <w:nsid w:val="48BE5F8C"/>
     <w:multiLevelType w:val="multilevel"/>
     <w:tmpl w:val="6E88F5BA"/>
@@ -4473,7 +5023,7 @@
       </w:rPr>
     </w:lvl>
   </w:abstractNum>
-  <w:abstractNum w:abstractNumId="18">
+  <w:abstractNum w:abstractNumId="20" w15:restartNumberingAfterBreak="0">
     <w:nsid w:val="4A706327"/>
     <w:multiLevelType w:val="multilevel"/>
     <w:tmpl w:val="5670686A"/>
@@ -4622,7 +5172,7 @@
       </w:rPr>
     </w:lvl>
   </w:abstractNum>
-  <w:abstractNum w:abstractNumId="19">
+  <w:abstractNum w:abstractNumId="21" w15:restartNumberingAfterBreak="0">
     <w:nsid w:val="51E21811"/>
     <w:multiLevelType w:val="multilevel"/>
     <w:tmpl w:val="FD4A8700"/>
@@ -4771,7 +5321,7 @@
       </w:rPr>
     </w:lvl>
   </w:abstractNum>
-  <w:abstractNum w:abstractNumId="20">
+  <w:abstractNum w:abstractNumId="22" w15:restartNumberingAfterBreak="0">
     <w:nsid w:val="532151B0"/>
     <w:multiLevelType w:val="multilevel"/>
     <w:tmpl w:val="0D086024"/>
@@ -4920,7 +5470,156 @@
       </w:rPr>
     </w:lvl>
   </w:abstractNum>
-  <w:abstractNum w:abstractNumId="21">
+  <w:abstractNum w:abstractNumId="23" w15:restartNumberingAfterBreak="0">
+    <w:nsid w:val="55515BF7"/>
+    <w:multiLevelType w:val="multilevel"/>
+    <w:tmpl w:val="B77473C4"/>
+    <w:lvl w:ilvl="0">
+      <w:start w:val="1"/>
+      <w:numFmt w:val="bullet"/>
+      <w:lvlText w:val=""/>
+      <w:lvlJc w:val="left"/>
+      <w:pPr>
+        <w:tabs>
+          <w:tab w:val="num" w:pos="720"/>
+        </w:tabs>
+        <w:ind w:left="720" w:hanging="360"/>
+      </w:pPr>
+      <w:rPr>
+        <w:rFonts w:ascii="Symbol" w:hAnsi="Symbol" w:hint="default"/>
+        <w:sz w:val="20"/>
+      </w:rPr>
+    </w:lvl>
+    <w:lvl w:ilvl="1" w:tentative="1">
+      <w:start w:val="1"/>
+      <w:numFmt w:val="bullet"/>
+      <w:lvlText w:val="o"/>
+      <w:lvlJc w:val="left"/>
+      <w:pPr>
+        <w:tabs>
+          <w:tab w:val="num" w:pos="1440"/>
+        </w:tabs>
+        <w:ind w:left="1440" w:hanging="360"/>
+      </w:pPr>
+      <w:rPr>
+        <w:rFonts w:ascii="Courier New" w:hAnsi="Courier New" w:hint="default"/>
+        <w:sz w:val="20"/>
+      </w:rPr>
+    </w:lvl>
+    <w:lvl w:ilvl="2" w:tentative="1">
+      <w:start w:val="1"/>
+      <w:numFmt w:val="bullet"/>
+      <w:lvlText w:val=""/>
+      <w:lvlJc w:val="left"/>
+      <w:pPr>
+        <w:tabs>
+          <w:tab w:val="num" w:pos="2160"/>
+        </w:tabs>
+        <w:ind w:left="2160" w:hanging="360"/>
+      </w:pPr>
+      <w:rPr>
+        <w:rFonts w:ascii="Wingdings" w:hAnsi="Wingdings" w:hint="default"/>
+        <w:sz w:val="20"/>
+      </w:rPr>
+    </w:lvl>
+    <w:lvl w:ilvl="3" w:tentative="1">
+      <w:start w:val="1"/>
+      <w:numFmt w:val="bullet"/>
+      <w:lvlText w:val=""/>
+      <w:lvlJc w:val="left"/>
+      <w:pPr>
+        <w:tabs>
+          <w:tab w:val="num" w:pos="2880"/>
+        </w:tabs>
+        <w:ind w:left="2880" w:hanging="360"/>
+      </w:pPr>
+      <w:rPr>
+        <w:rFonts w:ascii="Wingdings" w:hAnsi="Wingdings" w:hint="default"/>
+        <w:sz w:val="20"/>
+      </w:rPr>
+    </w:lvl>
+    <w:lvl w:ilvl="4" w:tentative="1">
+      <w:start w:val="1"/>
+      <w:numFmt w:val="bullet"/>
+      <w:lvlText w:val=""/>
+      <w:lvlJc w:val="left"/>
+      <w:pPr>
+        <w:tabs>
+          <w:tab w:val="num" w:pos="3600"/>
+        </w:tabs>
+        <w:ind w:left="3600" w:hanging="360"/>
+      </w:pPr>
+      <w:rPr>
+        <w:rFonts w:ascii="Wingdings" w:hAnsi="Wingdings" w:hint="default"/>
+        <w:sz w:val="20"/>
+      </w:rPr>
+    </w:lvl>
+    <w:lvl w:ilvl="5" w:tentative="1">
+      <w:start w:val="1"/>
+      <w:numFmt w:val="bullet"/>
+      <w:lvlText w:val=""/>
+      <w:lvlJc w:val="left"/>
+      <w:pPr>
+        <w:tabs>
+          <w:tab w:val="num" w:pos="4320"/>
+        </w:tabs>
+        <w:ind w:left="4320" w:hanging="360"/>
+      </w:pPr>
+      <w:rPr>
+        <w:rFonts w:ascii="Wingdings" w:hAnsi="Wingdings" w:hint="default"/>
+        <w:sz w:val="20"/>
+      </w:rPr>
+    </w:lvl>
+    <w:lvl w:ilvl="6" w:tentative="1">
+      <w:start w:val="1"/>
+      <w:numFmt w:val="bullet"/>
+      <w:lvlText w:val=""/>
+      <w:lvlJc w:val="left"/>
+      <w:pPr>
+        <w:tabs>
+          <w:tab w:val="num" w:pos="5040"/>
+        </w:tabs>
+        <w:ind w:left="5040" w:hanging="360"/>
+      </w:pPr>
+      <w:rPr>
+        <w:rFonts w:ascii="Wingdings" w:hAnsi="Wingdings" w:hint="default"/>
+        <w:sz w:val="20"/>
+      </w:rPr>
+    </w:lvl>
+    <w:lvl w:ilvl="7" w:tentative="1">
+      <w:start w:val="1"/>
+      <w:numFmt w:val="bullet"/>
+      <w:lvlText w:val=""/>
+      <w:lvlJc w:val="left"/>
+      <w:pPr>
+        <w:tabs>
+          <w:tab w:val="num" w:pos="5760"/>
+        </w:tabs>
+        <w:ind w:left="5760" w:hanging="360"/>
+      </w:pPr>
+      <w:rPr>
+        <w:rFonts w:ascii="Wingdings" w:hAnsi="Wingdings" w:hint="default"/>
+        <w:sz w:val="20"/>
+      </w:rPr>
+    </w:lvl>
+    <w:lvl w:ilvl="8" w:tentative="1">
+      <w:start w:val="1"/>
+      <w:numFmt w:val="bullet"/>
+      <w:lvlText w:val=""/>
+      <w:lvlJc w:val="left"/>
+      <w:pPr>
+        <w:tabs>
+          <w:tab w:val="num" w:pos="6480"/>
+        </w:tabs>
+        <w:ind w:left="6480" w:hanging="360"/>
+      </w:pPr>
+      <w:rPr>
+        <w:rFonts w:ascii="Wingdings" w:hAnsi="Wingdings" w:hint="default"/>
+        <w:sz w:val="20"/>
+      </w:rPr>
+    </w:lvl>
+  </w:abstractNum>
+  <w:abstractNum w:abstractNumId="24" w15:restartNumberingAfterBreak="0">
     <w:nsid w:val="578E3788"/>
     <w:multiLevelType w:val="multilevel"/>
     <w:tmpl w:val="21A8B608"/>
@@ -5069,7 +5768,7 @@
       </w:rPr>
     </w:lvl>
   </w:abstractNum>
-  <w:abstractNum w:abstractNumId="22">
+  <w:abstractNum w:abstractNumId="25" w15:restartNumberingAfterBreak="0">
     <w:nsid w:val="57FB7CA6"/>
     <w:multiLevelType w:val="multilevel"/>
     <w:tmpl w:val="961C5E4C"/>
@@ -5218,7 +5917,7 @@
       </w:rPr>
     </w:lvl>
   </w:abstractNum>
-  <w:abstractNum w:abstractNumId="23">
+  <w:abstractNum w:abstractNumId="26" w15:restartNumberingAfterBreak="0">
     <w:nsid w:val="5B1D2FAF"/>
     <w:multiLevelType w:val="multilevel"/>
     <w:tmpl w:val="069E37F6"/>
@@ -5367,7 +6066,7 @@
       </w:rPr>
     </w:lvl>
   </w:abstractNum>
-  <w:abstractNum w:abstractNumId="24">
+  <w:abstractNum w:abstractNumId="27" w15:restartNumberingAfterBreak="0">
     <w:nsid w:val="60894133"/>
     <w:multiLevelType w:val="multilevel"/>
     <w:tmpl w:val="F9025846"/>
@@ -5516,7 +6215,7 @@
       </w:rPr>
     </w:lvl>
   </w:abstractNum>
-  <w:abstractNum w:abstractNumId="25">
+  <w:abstractNum w:abstractNumId="28" w15:restartNumberingAfterBreak="0">
     <w:nsid w:val="64346862"/>
     <w:multiLevelType w:val="multilevel"/>
     <w:tmpl w:val="648A81A6"/>
@@ -5665,7 +6364,7 @@
       </w:rPr>
     </w:lvl>
   </w:abstractNum>
-  <w:abstractNum w:abstractNumId="26">
+  <w:abstractNum w:abstractNumId="29" w15:restartNumberingAfterBreak="0">
     <w:nsid w:val="64640F3C"/>
     <w:multiLevelType w:val="multilevel"/>
     <w:tmpl w:val="5AD64210"/>
@@ -5814,7 +6513,7 @@
       </w:rPr>
     </w:lvl>
   </w:abstractNum>
-  <w:abstractNum w:abstractNumId="27">
+  <w:abstractNum w:abstractNumId="30" w15:restartNumberingAfterBreak="0">
     <w:nsid w:val="6B376E5F"/>
     <w:multiLevelType w:val="multilevel"/>
     <w:tmpl w:val="009004C0"/>
@@ -5963,7 +6662,7 @@
       </w:rPr>
     </w:lvl>
   </w:abstractNum>
-  <w:abstractNum w:abstractNumId="28">
+  <w:abstractNum w:abstractNumId="31" w15:restartNumberingAfterBreak="0">
     <w:nsid w:val="6BCD6974"/>
     <w:multiLevelType w:val="multilevel"/>
     <w:tmpl w:val="9F2E3DB0"/>
@@ -6112,7 +6811,7 @@
       </w:rPr>
     </w:lvl>
   </w:abstractNum>
-  <w:abstractNum w:abstractNumId="29">
+  <w:abstractNum w:abstractNumId="32" w15:restartNumberingAfterBreak="0">
     <w:nsid w:val="70931114"/>
     <w:multiLevelType w:val="multilevel"/>
     <w:tmpl w:val="A314D588"/>
@@ -6261,7 +6960,7 @@
       </w:rPr>
     </w:lvl>
   </w:abstractNum>
-  <w:abstractNum w:abstractNumId="30">
+  <w:abstractNum w:abstractNumId="33" w15:restartNumberingAfterBreak="0">
     <w:nsid w:val="7220769C"/>
     <w:multiLevelType w:val="multilevel"/>
     <w:tmpl w:val="11427F9C"/>
@@ -6410,7 +7109,7 @@
       </w:rPr>
     </w:lvl>
   </w:abstractNum>
-  <w:abstractNum w:abstractNumId="31">
+  <w:abstractNum w:abstractNumId="34" w15:restartNumberingAfterBreak="0">
     <w:nsid w:val="72D82598"/>
     <w:multiLevelType w:val="multilevel"/>
     <w:tmpl w:val="F1B66624"/>
@@ -6559,7 +7258,7 @@
       </w:rPr>
     </w:lvl>
   </w:abstractNum>
-  <w:abstractNum w:abstractNumId="32">
+  <w:abstractNum w:abstractNumId="35" w15:restartNumberingAfterBreak="0">
     <w:nsid w:val="7308571D"/>
     <w:multiLevelType w:val="multilevel"/>
     <w:tmpl w:val="86E68DBC"/>
@@ -6708,7 +7407,7 @@
       </w:rPr>
     </w:lvl>
   </w:abstractNum>
-  <w:abstractNum w:abstractNumId="33">
+  <w:abstractNum w:abstractNumId="36" w15:restartNumberingAfterBreak="0">
     <w:nsid w:val="75E76A92"/>
     <w:multiLevelType w:val="multilevel"/>
     <w:tmpl w:val="854C3CC4"/>
@@ -6857,7 +7556,7 @@
       </w:rPr>
     </w:lvl>
   </w:abstractNum>
-  <w:abstractNum w:abstractNumId="34">
+  <w:abstractNum w:abstractNumId="37" w15:restartNumberingAfterBreak="0">
     <w:nsid w:val="76A20783"/>
     <w:multiLevelType w:val="multilevel"/>
     <w:tmpl w:val="C9928DC0"/>
@@ -7006,7 +7705,7 @@
       </w:rPr>
     </w:lvl>
   </w:abstractNum>
-  <w:abstractNum w:abstractNumId="35">
+  <w:abstractNum w:abstractNumId="38" w15:restartNumberingAfterBreak="0">
     <w:nsid w:val="7899679E"/>
     <w:multiLevelType w:val="multilevel"/>
     <w:tmpl w:val="E8EA175E"/>
@@ -7155,7 +7854,7 @@
       </w:rPr>
     </w:lvl>
   </w:abstractNum>
-  <w:abstractNum w:abstractNumId="36">
+  <w:abstractNum w:abstractNumId="39" w15:restartNumberingAfterBreak="0">
     <w:nsid w:val="7D2C60EB"/>
     <w:multiLevelType w:val="multilevel"/>
     <w:tmpl w:val="E436985A"/>
@@ -7304,7 +8003,7 @@
       </w:rPr>
     </w:lvl>
   </w:abstractNum>
-  <w:abstractNum w:abstractNumId="37">
+  <w:abstractNum w:abstractNumId="40" w15:restartNumberingAfterBreak="0">
     <w:nsid w:val="7E780683"/>
     <w:multiLevelType w:val="multilevel"/>
     <w:tmpl w:val="014C15CC"/>
@@ -7453,7 +8152,7 @@
       </w:rPr>
     </w:lvl>
   </w:abstractNum>
-  <w:abstractNum w:abstractNumId="38">
+  <w:abstractNum w:abstractNumId="41" w15:restartNumberingAfterBreak="0">
     <w:nsid w:val="7EA729D7"/>
     <w:multiLevelType w:val="multilevel"/>
     <w:tmpl w:val="9B080324"/>
@@ -7602,128 +8301,137 @@
       </w:rPr>
     </w:lvl>
   </w:abstractNum>
-  <w:num w:numId="1">
+  <w:num w:numId="1" w16cid:durableId="636451128">
     <w:abstractNumId w:val="2"/>
   </w:num>
-  <w:num w:numId="2">
+  <w:num w:numId="2" w16cid:durableId="1277978147">
+    <w:abstractNumId w:val="30"/>
+  </w:num>
+  <w:num w:numId="3" w16cid:durableId="890732258">
+    <w:abstractNumId w:val="21"/>
+  </w:num>
+  <w:num w:numId="4" w16cid:durableId="40908629">
+    <w:abstractNumId w:val="22"/>
+  </w:num>
+  <w:num w:numId="5" w16cid:durableId="829255493">
+    <w:abstractNumId w:val="28"/>
+  </w:num>
+  <w:num w:numId="6" w16cid:durableId="77017697">
+    <w:abstractNumId w:val="33"/>
+  </w:num>
+  <w:num w:numId="7" w16cid:durableId="1309213161">
+    <w:abstractNumId w:val="0"/>
+  </w:num>
+  <w:num w:numId="8" w16cid:durableId="321128086">
+    <w:abstractNumId w:val="11"/>
+  </w:num>
+  <w:num w:numId="9" w16cid:durableId="71782647">
+    <w:abstractNumId w:val="13"/>
+  </w:num>
+  <w:num w:numId="10" w16cid:durableId="1437141496">
+    <w:abstractNumId w:val="34"/>
+  </w:num>
+  <w:num w:numId="11" w16cid:durableId="1367682883">
+    <w:abstractNumId w:val="9"/>
+  </w:num>
+  <w:num w:numId="12" w16cid:durableId="1910267919">
+    <w:abstractNumId w:val="38"/>
+  </w:num>
+  <w:num w:numId="13" w16cid:durableId="1227491016">
+    <w:abstractNumId w:val="16"/>
+  </w:num>
+  <w:num w:numId="14" w16cid:durableId="363098327">
+    <w:abstractNumId w:val="20"/>
+  </w:num>
+  <w:num w:numId="15" w16cid:durableId="1547378081">
+    <w:abstractNumId w:val="35"/>
+  </w:num>
+  <w:num w:numId="16" w16cid:durableId="392001111">
+    <w:abstractNumId w:val="17"/>
+  </w:num>
+  <w:num w:numId="17" w16cid:durableId="1543858586">
+    <w:abstractNumId w:val="15"/>
+  </w:num>
+  <w:num w:numId="18" w16cid:durableId="623969113">
+    <w:abstractNumId w:val="37"/>
+  </w:num>
+  <w:num w:numId="19" w16cid:durableId="325598299">
+    <w:abstractNumId w:val="5"/>
+  </w:num>
+  <w:num w:numId="20" w16cid:durableId="970280544">
+    <w:abstractNumId w:val="32"/>
+  </w:num>
+  <w:num w:numId="21" w16cid:durableId="798760274">
+    <w:abstractNumId w:val="25"/>
+  </w:num>
+  <w:num w:numId="22" w16cid:durableId="543059600">
+    <w:abstractNumId w:val="40"/>
+  </w:num>
+  <w:num w:numId="23" w16cid:durableId="2129658071">
+    <w:abstractNumId w:val="29"/>
+  </w:num>
+  <w:num w:numId="24" w16cid:durableId="917712370">
+    <w:abstractNumId w:val="26"/>
+  </w:num>
+  <w:num w:numId="25" w16cid:durableId="1361512761">
+    <w:abstractNumId w:val="36"/>
+  </w:num>
+  <w:num w:numId="26" w16cid:durableId="59790895">
+    <w:abstractNumId w:val="24"/>
+  </w:num>
+  <w:num w:numId="27" w16cid:durableId="797797467">
+    <w:abstractNumId w:val="12"/>
+  </w:num>
+  <w:num w:numId="28" w16cid:durableId="263343348">
     <w:abstractNumId w:val="27"/>
   </w:num>
-  <w:num w:numId="3">
+  <w:num w:numId="29" w16cid:durableId="145561099">
+    <w:abstractNumId w:val="7"/>
+  </w:num>
+  <w:num w:numId="30" w16cid:durableId="77597421">
+    <w:abstractNumId w:val="41"/>
+  </w:num>
+  <w:num w:numId="31" w16cid:durableId="333193579">
+    <w:abstractNumId w:val="31"/>
+  </w:num>
+  <w:num w:numId="32" w16cid:durableId="836649827">
+    <w:abstractNumId w:val="3"/>
+  </w:num>
+  <w:num w:numId="33" w16cid:durableId="1462840176">
+    <w:abstractNumId w:val="8"/>
+  </w:num>
+  <w:num w:numId="34" w16cid:durableId="485325024">
+    <w:abstractNumId w:val="6"/>
+  </w:num>
+  <w:num w:numId="35" w16cid:durableId="334499643">
+    <w:abstractNumId w:val="1"/>
+  </w:num>
+  <w:num w:numId="36" w16cid:durableId="27923448">
+    <w:abstractNumId w:val="10"/>
+  </w:num>
+  <w:num w:numId="37" w16cid:durableId="794056440">
     <w:abstractNumId w:val="19"/>
   </w:num>
-  <w:num w:numId="4">
-    <w:abstractNumId w:val="20"/>
+  <w:num w:numId="38" w16cid:durableId="1128082151">
+    <w:abstractNumId w:val="39"/>
   </w:num>
-  <w:num w:numId="5">
-    <w:abstractNumId w:val="25"/>
+  <w:num w:numId="39" w16cid:durableId="129326584">
+    <w:abstractNumId w:val="4"/>
   </w:num>
-  <w:num w:numId="6">
-    <w:abstractNumId w:val="30"/>
-  </w:num>
-  <w:num w:numId="7">
-    <w:abstractNumId w:val="0"/>
-  </w:num>
-  <w:num w:numId="8">
-    <w:abstractNumId w:val="11"/>
-  </w:num>
-  <w:num w:numId="9">
-    <w:abstractNumId w:val="13"/>
-  </w:num>
-  <w:num w:numId="10">
-    <w:abstractNumId w:val="31"/>
-  </w:num>
-  <w:num w:numId="11">
-    <w:abstractNumId w:val="9"/>
-  </w:num>
-  <w:num w:numId="12">
-    <w:abstractNumId w:val="35"/>
-  </w:num>
-  <w:num w:numId="13">
-    <w:abstractNumId w:val="15"/>
-  </w:num>
-  <w:num w:numId="14">
+  <w:num w:numId="40" w16cid:durableId="177813225">
     <w:abstractNumId w:val="18"/>
   </w:num>
-  <w:num w:numId="15">
-    <w:abstractNumId w:val="32"/>
-  </w:num>
-  <w:num w:numId="16">
-    <w:abstractNumId w:val="16"/>
-  </w:num>
-  <w:num w:numId="17">
-    <w:abstractNumId w:val="14"/>
-  </w:num>
-  <w:num w:numId="18">
-    <w:abstractNumId w:val="34"/>
-  </w:num>
-  <w:num w:numId="19">
-    <w:abstractNumId w:val="5"/>
-  </w:num>
-  <w:num w:numId="20">
-    <w:abstractNumId w:val="29"/>
-  </w:num>
-  <w:num w:numId="21">
-    <w:abstractNumId w:val="22"/>
-  </w:num>
-  <w:num w:numId="22">
-    <w:abstractNumId w:val="37"/>
-  </w:num>
-  <w:num w:numId="23">
-    <w:abstractNumId w:val="26"/>
-  </w:num>
-  <w:num w:numId="24">
+  <w:num w:numId="41" w16cid:durableId="1198740426">
     <w:abstractNumId w:val="23"/>
   </w:num>
-  <w:num w:numId="25">
-    <w:abstractNumId w:val="33"/>
-  </w:num>
-  <w:num w:numId="26">
-    <w:abstractNumId w:val="21"/>
-  </w:num>
-  <w:num w:numId="27">
-    <w:abstractNumId w:val="12"/>
-  </w:num>
-  <w:num w:numId="28">
-    <w:abstractNumId w:val="24"/>
-  </w:num>
-  <w:num w:numId="29">
-    <w:abstractNumId w:val="7"/>
-  </w:num>
-  <w:num w:numId="30">
-    <w:abstractNumId w:val="38"/>
-  </w:num>
-  <w:num w:numId="31">
-    <w:abstractNumId w:val="28"/>
-  </w:num>
-  <w:num w:numId="32">
-    <w:abstractNumId w:val="3"/>
-  </w:num>
-  <w:num w:numId="33">
-    <w:abstractNumId w:val="8"/>
-  </w:num>
-  <w:num w:numId="34">
-    <w:abstractNumId w:val="6"/>
-  </w:num>
-  <w:num w:numId="35">
-    <w:abstractNumId w:val="1"/>
-  </w:num>
-  <w:num w:numId="36">
-    <w:abstractNumId w:val="10"/>
-  </w:num>
-  <w:num w:numId="37">
-    <w:abstractNumId w:val="17"/>
-  </w:num>
-  <w:num w:numId="38">
-    <w:abstractNumId w:val="36"/>
-  </w:num>
-  <w:num w:numId="39">
-    <w:abstractNumId w:val="4"/>
+  <w:num w:numId="42" w16cid:durableId="1405880271">
+    <w:abstractNumId w:val="14"/>
   </w:num>
 </w:numbering>
 </file>
 
 <file path=word/styles.xml><?xml version="1.0" encoding="utf-8"?>
-<w:styles xmlns:mc="http://schemas.openxmlformats.org/markup-compatibility/2006" xmlns:r="http://schemas.openxmlformats.org/officeDocument/2006/relationships" xmlns:w="http://schemas.openxmlformats.org/wordprocessingml/2006/main" xmlns:w14="http://schemas.microsoft.com/office/word/2010/wordml" xmlns:w15="http://schemas.microsoft.com/office/word/2012/wordml" mc:Ignorable="w14 w15">
+<w:styles xmlns:mc="http://schemas.openxmlformats.org/markup-compatibility/2006" xmlns:r="http://schemas.openxmlformats.org/officeDocument/2006/relationships" xmlns:w="http://schemas.openxmlformats.org/wordprocessingml/2006/main" xmlns:w14="http://schemas.microsoft.com/office/word/2010/wordml" xmlns:w15="http://schemas.microsoft.com/office/word/2012/wordml" xmlns:w16cex="http://schemas.microsoft.com/office/word/2018/wordml/cex" xmlns:w16cid="http://schemas.microsoft.com/office/word/2016/wordml/cid" xmlns:w16="http://schemas.microsoft.com/office/word/2018/wordml" xmlns:w16sdtdh="http://schemas.microsoft.com/office/word/2020/wordml/sdtdatahash" xmlns:w16se="http://schemas.microsoft.com/office/word/2015/wordml/symex" mc:Ignorable="w14 w15 w16se w16cid w16 w16cex w16sdtdh">
   <w:docDefaults>
     <w:rPrDefault>
       <w:rPr>
@@ -7739,7 +8447,7 @@
       </w:pPr>
     </w:pPrDefault>
   </w:docDefaults>
-  <w:latentStyles w:defLockedState="0" w:defUIPriority="99" w:defSemiHidden="0" w:defUnhideWhenUsed="0" w:defQFormat="0" w:count="371">
+  <w:latentStyles w:defLockedState="0" w:defUIPriority="99" w:defSemiHidden="0" w:defUnhideWhenUsed="0" w:defQFormat="0" w:count="376">
     <w:lsdException w:name="Normal" w:uiPriority="0" w:qFormat="1"/>
     <w:lsdException w:name="heading 1" w:uiPriority="9" w:qFormat="1"/>
     <w:lsdException w:name="heading 2" w:semiHidden="1" w:uiPriority="9" w:unhideWhenUsed="1" w:qFormat="1"/>
@@ -8111,6 +8819,11 @@
     <w:lsdException w:name="List Table 5 Dark Accent 6" w:uiPriority="50"/>
     <w:lsdException w:name="List Table 6 Colorful Accent 6" w:uiPriority="51"/>
     <w:lsdException w:name="List Table 7 Colorful Accent 6" w:uiPriority="52"/>
+    <w:lsdException w:name="Mention" w:semiHidden="1" w:unhideWhenUsed="1"/>
+    <w:lsdException w:name="Smart Hyperlink" w:semiHidden="1" w:unhideWhenUsed="1"/>
+    <w:lsdException w:name="Hashtag" w:semiHidden="1" w:unhideWhenUsed="1"/>
+    <w:lsdException w:name="Unresolved Mention" w:semiHidden="1" w:unhideWhenUsed="1"/>
+    <w:lsdException w:name="Smart Link" w:semiHidden="1" w:unhideWhenUsed="1"/>
   </w:latentStyles>
   <w:style w:type="paragraph" w:default="1" w:styleId="Normal">
     <w:name w:val="Normal"/>
@@ -8240,7 +8953,6 @@
   <w:style w:type="character" w:default="1" w:styleId="Fontepargpadro">
     <w:name w:val="Default Paragraph Font"/>
     <w:uiPriority w:val="1"/>
-    <w:semiHidden/>
     <w:unhideWhenUsed/>
   </w:style>
   <w:style w:type="table" w:default="1" w:styleId="Tabelanormal">

</xml_diff>